<commit_message>
Draw A house, some changes
</commit_message>
<xml_diff>
--- a/07_Methoden/Übungen/DrawAHouse/DrawAHouse.docx
+++ b/07_Methoden/Übungen/DrawAHouse/DrawAHouse.docx
@@ -53,6 +53,7 @@
         </w:numPr>
         <w:ind w:left="426"/>
       </w:pPr>
+      <w:proofErr w:type="spellStart"/>
       <w:r>
         <w:rPr>
           <w:rFonts w:ascii="Cascadia Mono" w:hAnsi="Cascadia Mono" w:cs="Cascadia Mono"/>
@@ -62,18 +63,39 @@
         </w:rPr>
         <w:t>void</w:t>
       </w:r>
-      <w:r>
-        <w:rPr>
-          <w:rFonts w:ascii="Cascadia Mono" w:hAnsi="Cascadia Mono" w:cs="Cascadia Mono"/>
-          <w:color w:val="000000"/>
-          <w:sz w:val="19"/>
-          <w:szCs w:val="19"/>
-        </w:rPr>
-        <w:t xml:space="preserve"> Initialize()</w:t>
-      </w:r>
-      <w:r>
+      <w:proofErr w:type="spellEnd"/>
+      <w:r>
+        <w:rPr>
+          <w:rFonts w:ascii="Cascadia Mono" w:hAnsi="Cascadia Mono" w:cs="Cascadia Mono"/>
+          <w:color w:val="000000"/>
+          <w:sz w:val="19"/>
+          <w:szCs w:val="19"/>
+        </w:rPr>
         <w:t xml:space="preserve"> </w:t>
       </w:r>
+      <w:proofErr w:type="gramStart"/>
+      <w:r>
+        <w:rPr>
+          <w:rFonts w:ascii="Cascadia Mono" w:hAnsi="Cascadia Mono" w:cs="Cascadia Mono"/>
+          <w:color w:val="000000"/>
+          <w:sz w:val="19"/>
+          <w:szCs w:val="19"/>
+        </w:rPr>
+        <w:t>Initialize(</w:t>
+      </w:r>
+      <w:proofErr w:type="gramEnd"/>
+      <w:r>
+        <w:rPr>
+          <w:rFonts w:ascii="Cascadia Mono" w:hAnsi="Cascadia Mono" w:cs="Cascadia Mono"/>
+          <w:color w:val="000000"/>
+          <w:sz w:val="19"/>
+          <w:szCs w:val="19"/>
+        </w:rPr>
+        <w:t>)</w:t>
+      </w:r>
+      <w:r>
+        <w:t xml:space="preserve"> </w:t>
+      </w:r>
       <w:r>
         <w:br/>
       </w:r>
@@ -83,14 +105,25 @@
       <w:r>
         <w:br/>
       </w:r>
-      <w:r>
-        <w:rPr>
-          <w:rFonts w:ascii="Cascadia Mono" w:hAnsi="Cascadia Mono" w:cs="Cascadia Mono"/>
-          <w:color w:val="000000"/>
-          <w:sz w:val="19"/>
-          <w:szCs w:val="19"/>
-        </w:rPr>
-        <w:t>Console.SetWindowSize(COLS, ROWS);</w:t>
+      <w:proofErr w:type="spellStart"/>
+      <w:r>
+        <w:rPr>
+          <w:rFonts w:ascii="Cascadia Mono" w:hAnsi="Cascadia Mono" w:cs="Cascadia Mono"/>
+          <w:color w:val="000000"/>
+          <w:sz w:val="19"/>
+          <w:szCs w:val="19"/>
+        </w:rPr>
+        <w:t>Console.SetWindowSize</w:t>
+      </w:r>
+      <w:proofErr w:type="spellEnd"/>
+      <w:r>
+        <w:rPr>
+          <w:rFonts w:ascii="Cascadia Mono" w:hAnsi="Cascadia Mono" w:cs="Cascadia Mono"/>
+          <w:color w:val="000000"/>
+          <w:sz w:val="19"/>
+          <w:szCs w:val="19"/>
+        </w:rPr>
+        <w:t>(COLS, ROWS);</w:t>
       </w:r>
       <w:r>
         <w:rPr>
@@ -121,6 +154,7 @@
         </w:numPr>
         <w:ind w:left="426"/>
       </w:pPr>
+      <w:proofErr w:type="spellStart"/>
       <w:r>
         <w:rPr>
           <w:rFonts w:ascii="Cascadia Mono" w:hAnsi="Cascadia Mono" w:cs="Cascadia Mono"/>
@@ -130,15 +164,39 @@
         </w:rPr>
         <w:t>void</w:t>
       </w:r>
-      <w:r>
-        <w:rPr>
-          <w:rFonts w:ascii="Cascadia Mono" w:hAnsi="Cascadia Mono" w:cs="Cascadia Mono"/>
-          <w:color w:val="000000"/>
-          <w:sz w:val="19"/>
-          <w:szCs w:val="19"/>
-        </w:rPr>
-        <w:t xml:space="preserve"> DrawDot(</w:t>
-      </w:r>
+      <w:proofErr w:type="spellEnd"/>
+      <w:r>
+        <w:rPr>
+          <w:rFonts w:ascii="Cascadia Mono" w:hAnsi="Cascadia Mono" w:cs="Cascadia Mono"/>
+          <w:color w:val="000000"/>
+          <w:sz w:val="19"/>
+          <w:szCs w:val="19"/>
+        </w:rPr>
+        <w:t xml:space="preserve"> </w:t>
+      </w:r>
+      <w:proofErr w:type="spellStart"/>
+      <w:proofErr w:type="gramStart"/>
+      <w:r>
+        <w:rPr>
+          <w:rFonts w:ascii="Cascadia Mono" w:hAnsi="Cascadia Mono" w:cs="Cascadia Mono"/>
+          <w:color w:val="000000"/>
+          <w:sz w:val="19"/>
+          <w:szCs w:val="19"/>
+        </w:rPr>
+        <w:t>DrawDot</w:t>
+      </w:r>
+      <w:proofErr w:type="spellEnd"/>
+      <w:r>
+        <w:rPr>
+          <w:rFonts w:ascii="Cascadia Mono" w:hAnsi="Cascadia Mono" w:cs="Cascadia Mono"/>
+          <w:color w:val="000000"/>
+          <w:sz w:val="19"/>
+          <w:szCs w:val="19"/>
+        </w:rPr>
+        <w:t>(</w:t>
+      </w:r>
+      <w:proofErr w:type="spellStart"/>
+      <w:proofErr w:type="gramEnd"/>
       <w:r>
         <w:rPr>
           <w:rFonts w:ascii="Cascadia Mono" w:hAnsi="Cascadia Mono" w:cs="Cascadia Mono"/>
@@ -148,6 +206,7 @@
         </w:rPr>
         <w:t>int</w:t>
       </w:r>
+      <w:proofErr w:type="spellEnd"/>
       <w:r>
         <w:rPr>
           <w:rFonts w:ascii="Cascadia Mono" w:hAnsi="Cascadia Mono" w:cs="Cascadia Mono"/>
@@ -157,6 +216,7 @@
         </w:rPr>
         <w:t xml:space="preserve"> x, </w:t>
       </w:r>
+      <w:proofErr w:type="spellStart"/>
       <w:r>
         <w:rPr>
           <w:rFonts w:ascii="Cascadia Mono" w:hAnsi="Cascadia Mono" w:cs="Cascadia Mono"/>
@@ -166,14 +226,55 @@
         </w:rPr>
         <w:t>int</w:t>
       </w:r>
-      <w:r>
-        <w:rPr>
-          <w:rFonts w:ascii="Cascadia Mono" w:hAnsi="Cascadia Mono" w:cs="Cascadia Mono"/>
-          <w:color w:val="000000"/>
-          <w:sz w:val="19"/>
-          <w:szCs w:val="19"/>
-        </w:rPr>
-        <w:t xml:space="preserve"> y, ConsoleColor color)</w:t>
+      <w:proofErr w:type="spellEnd"/>
+      <w:r>
+        <w:rPr>
+          <w:rFonts w:ascii="Cascadia Mono" w:hAnsi="Cascadia Mono" w:cs="Cascadia Mono"/>
+          <w:color w:val="000000"/>
+          <w:sz w:val="19"/>
+          <w:szCs w:val="19"/>
+        </w:rPr>
+        <w:t xml:space="preserve"> y, </w:t>
+      </w:r>
+      <w:proofErr w:type="spellStart"/>
+      <w:r>
+        <w:rPr>
+          <w:rFonts w:ascii="Cascadia Mono" w:hAnsi="Cascadia Mono" w:cs="Cascadia Mono"/>
+          <w:color w:val="000000"/>
+          <w:sz w:val="19"/>
+          <w:szCs w:val="19"/>
+        </w:rPr>
+        <w:t>ConsoleColor</w:t>
+      </w:r>
+      <w:proofErr w:type="spellEnd"/>
+      <w:r>
+        <w:rPr>
+          <w:rFonts w:ascii="Cascadia Mono" w:hAnsi="Cascadia Mono" w:cs="Cascadia Mono"/>
+          <w:color w:val="000000"/>
+          <w:sz w:val="19"/>
+          <w:szCs w:val="19"/>
+        </w:rPr>
+        <w:t xml:space="preserve"> </w:t>
+      </w:r>
+      <w:proofErr w:type="spellStart"/>
+      <w:r>
+        <w:rPr>
+          <w:rFonts w:ascii="Cascadia Mono" w:hAnsi="Cascadia Mono" w:cs="Cascadia Mono"/>
+          <w:color w:val="000000"/>
+          <w:sz w:val="19"/>
+          <w:szCs w:val="19"/>
+        </w:rPr>
+        <w:t>color</w:t>
+      </w:r>
+      <w:proofErr w:type="spellEnd"/>
+      <w:r>
+        <w:rPr>
+          <w:rFonts w:ascii="Cascadia Mono" w:hAnsi="Cascadia Mono" w:cs="Cascadia Mono"/>
+          <w:color w:val="000000"/>
+          <w:sz w:val="19"/>
+          <w:szCs w:val="19"/>
+        </w:rPr>
+        <w:t>)</w:t>
       </w:r>
       <w:r>
         <w:rPr>
@@ -187,14 +288,25 @@
       <w:r>
         <w:t xml:space="preserve">An der durch x und y festgelegten Bildschirmposition (siehe </w:t>
       </w:r>
-      <w:r>
-        <w:rPr>
-          <w:rFonts w:ascii="Cascadia Mono" w:hAnsi="Cascadia Mono" w:cs="Cascadia Mono"/>
-          <w:color w:val="000000"/>
-          <w:sz w:val="19"/>
-          <w:szCs w:val="19"/>
-        </w:rPr>
-        <w:t xml:space="preserve">Console.SetCursorPosition) </w:t>
+      <w:proofErr w:type="spellStart"/>
+      <w:r>
+        <w:rPr>
+          <w:rFonts w:ascii="Cascadia Mono" w:hAnsi="Cascadia Mono" w:cs="Cascadia Mono"/>
+          <w:color w:val="000000"/>
+          <w:sz w:val="19"/>
+          <w:szCs w:val="19"/>
+        </w:rPr>
+        <w:t>Console.SetCursorPosition</w:t>
+      </w:r>
+      <w:proofErr w:type="spellEnd"/>
+      <w:r>
+        <w:rPr>
+          <w:rFonts w:ascii="Cascadia Mono" w:hAnsi="Cascadia Mono" w:cs="Cascadia Mono"/>
+          <w:color w:val="000000"/>
+          <w:sz w:val="19"/>
+          <w:szCs w:val="19"/>
+        </w:rPr>
+        <w:t xml:space="preserve">) </w:t>
       </w:r>
       <w:r>
         <w:t xml:space="preserve">wird mit der angegebenen Vordergrundfarbe </w:t>
@@ -219,14 +331,25 @@
         <w:br/>
         <w:t xml:space="preserve">Im Gegensatz zu </w:t>
       </w:r>
-      <w:r>
-        <w:rPr>
-          <w:rFonts w:ascii="Cascadia Mono" w:hAnsi="Cascadia Mono" w:cs="Cascadia Mono"/>
-          <w:color w:val="000000"/>
-          <w:sz w:val="19"/>
-          <w:szCs w:val="19"/>
-        </w:rPr>
-        <w:t xml:space="preserve">SetCursorPosition </w:t>
+      <w:proofErr w:type="spellStart"/>
+      <w:r>
+        <w:rPr>
+          <w:rFonts w:ascii="Cascadia Mono" w:hAnsi="Cascadia Mono" w:cs="Cascadia Mono"/>
+          <w:color w:val="000000"/>
+          <w:sz w:val="19"/>
+          <w:szCs w:val="19"/>
+        </w:rPr>
+        <w:t>SetCursorPosition</w:t>
+      </w:r>
+      <w:proofErr w:type="spellEnd"/>
+      <w:r>
+        <w:rPr>
+          <w:rFonts w:ascii="Cascadia Mono" w:hAnsi="Cascadia Mono" w:cs="Cascadia Mono"/>
+          <w:color w:val="000000"/>
+          <w:sz w:val="19"/>
+          <w:szCs w:val="19"/>
+        </w:rPr>
+        <w:t xml:space="preserve"> </w:t>
       </w:r>
       <w:r>
         <w:t xml:space="preserve">soll die y Achse nach </w:t>
@@ -289,6 +412,7 @@
         </w:numPr>
         <w:ind w:left="426"/>
       </w:pPr>
+      <w:proofErr w:type="spellStart"/>
       <w:r>
         <w:rPr>
           <w:rFonts w:ascii="Cascadia Mono" w:hAnsi="Cascadia Mono" w:cs="Cascadia Mono"/>
@@ -298,15 +422,38 @@
         </w:rPr>
         <w:t>void</w:t>
       </w:r>
-      <w:r>
-        <w:rPr>
-          <w:rFonts w:ascii="Cascadia Mono" w:hAnsi="Cascadia Mono" w:cs="Cascadia Mono"/>
-          <w:color w:val="000000"/>
-          <w:sz w:val="19"/>
-          <w:szCs w:val="19"/>
-        </w:rPr>
-        <w:t xml:space="preserve"> DrawLine(</w:t>
-      </w:r>
+      <w:proofErr w:type="spellEnd"/>
+      <w:r>
+        <w:rPr>
+          <w:rFonts w:ascii="Cascadia Mono" w:hAnsi="Cascadia Mono" w:cs="Cascadia Mono"/>
+          <w:color w:val="000000"/>
+          <w:sz w:val="19"/>
+          <w:szCs w:val="19"/>
+        </w:rPr>
+        <w:t xml:space="preserve"> </w:t>
+      </w:r>
+      <w:proofErr w:type="spellStart"/>
+      <w:proofErr w:type="gramStart"/>
+      <w:r>
+        <w:rPr>
+          <w:rFonts w:ascii="Cascadia Mono" w:hAnsi="Cascadia Mono" w:cs="Cascadia Mono"/>
+          <w:color w:val="000000"/>
+          <w:sz w:val="19"/>
+          <w:szCs w:val="19"/>
+        </w:rPr>
+        <w:t>DrawLine</w:t>
+      </w:r>
+      <w:proofErr w:type="spellEnd"/>
+      <w:r>
+        <w:rPr>
+          <w:rFonts w:ascii="Cascadia Mono" w:hAnsi="Cascadia Mono" w:cs="Cascadia Mono"/>
+          <w:color w:val="000000"/>
+          <w:sz w:val="19"/>
+          <w:szCs w:val="19"/>
+        </w:rPr>
+        <w:t>(</w:t>
+      </w:r>
+      <w:proofErr w:type="gramEnd"/>
       <w:r>
         <w:rPr>
           <w:rFonts w:ascii="Cascadia Mono" w:hAnsi="Cascadia Mono" w:cs="Cascadia Mono"/>
@@ -352,6 +499,1032 @@
       <w:r>
         <w:br/>
         <w:t>Der Methodenrumpf könnte wie folgt aussehen.</w:t>
+      </w:r>
+    </w:p>
+    <w:p>
+      <w:pPr>
+        <w:autoSpaceDE w:val="0"/>
+        <w:autoSpaceDN w:val="0"/>
+        <w:adjustRightInd w:val="0"/>
+        <w:spacing w:after="0" w:line="240" w:lineRule="auto"/>
+        <w:rPr>
+          <w:rFonts w:ascii="Cascadia Mono" w:hAnsi="Cascadia Mono" w:cs="Cascadia Mono"/>
+          <w:color w:val="000000"/>
+          <w:sz w:val="19"/>
+          <w:szCs w:val="19"/>
+        </w:rPr>
+      </w:pPr>
+      <w:r>
+        <w:rPr>
+          <w:rFonts w:ascii="Cascadia Mono" w:hAnsi="Cascadia Mono" w:cs="Cascadia Mono"/>
+          <w:color w:val="000000"/>
+          <w:sz w:val="19"/>
+          <w:szCs w:val="19"/>
+        </w:rPr>
+        <w:t xml:space="preserve">    </w:t>
+      </w:r>
+      <w:proofErr w:type="spellStart"/>
+      <w:r>
+        <w:rPr>
+          <w:rFonts w:ascii="Cascadia Mono" w:hAnsi="Cascadia Mono" w:cs="Cascadia Mono"/>
+          <w:color w:val="0000FF"/>
+          <w:sz w:val="19"/>
+          <w:szCs w:val="19"/>
+        </w:rPr>
+        <w:t>int</w:t>
+      </w:r>
+      <w:proofErr w:type="spellEnd"/>
+      <w:r>
+        <w:rPr>
+          <w:rFonts w:ascii="Cascadia Mono" w:hAnsi="Cascadia Mono" w:cs="Cascadia Mono"/>
+          <w:color w:val="000000"/>
+          <w:sz w:val="19"/>
+          <w:szCs w:val="19"/>
+        </w:rPr>
+        <w:t xml:space="preserve"> </w:t>
+      </w:r>
+      <w:proofErr w:type="spellStart"/>
+      <w:r>
+        <w:rPr>
+          <w:rFonts w:ascii="Cascadia Mono" w:hAnsi="Cascadia Mono" w:cs="Cascadia Mono"/>
+          <w:color w:val="000000"/>
+          <w:sz w:val="19"/>
+          <w:szCs w:val="19"/>
+        </w:rPr>
+        <w:t>distanceX</w:t>
+      </w:r>
+      <w:proofErr w:type="spellEnd"/>
+      <w:r>
+        <w:rPr>
+          <w:rFonts w:ascii="Cascadia Mono" w:hAnsi="Cascadia Mono" w:cs="Cascadia Mono"/>
+          <w:color w:val="000000"/>
+          <w:sz w:val="19"/>
+          <w:szCs w:val="19"/>
+        </w:rPr>
+        <w:t xml:space="preserve"> = x1 - x0;</w:t>
+      </w:r>
+    </w:p>
+    <w:p>
+      <w:pPr>
+        <w:autoSpaceDE w:val="0"/>
+        <w:autoSpaceDN w:val="0"/>
+        <w:adjustRightInd w:val="0"/>
+        <w:spacing w:after="0" w:line="240" w:lineRule="auto"/>
+        <w:rPr>
+          <w:rFonts w:ascii="Cascadia Mono" w:hAnsi="Cascadia Mono" w:cs="Cascadia Mono"/>
+          <w:color w:val="000000"/>
+          <w:sz w:val="19"/>
+          <w:szCs w:val="19"/>
+        </w:rPr>
+      </w:pPr>
+      <w:r>
+        <w:rPr>
+          <w:rFonts w:ascii="Cascadia Mono" w:hAnsi="Cascadia Mono" w:cs="Cascadia Mono"/>
+          <w:color w:val="000000"/>
+          <w:sz w:val="19"/>
+          <w:szCs w:val="19"/>
+        </w:rPr>
+        <w:t xml:space="preserve">    </w:t>
+      </w:r>
+      <w:proofErr w:type="spellStart"/>
+      <w:r>
+        <w:rPr>
+          <w:rFonts w:ascii="Cascadia Mono" w:hAnsi="Cascadia Mono" w:cs="Cascadia Mono"/>
+          <w:color w:val="0000FF"/>
+          <w:sz w:val="19"/>
+          <w:szCs w:val="19"/>
+        </w:rPr>
+        <w:t>int</w:t>
+      </w:r>
+      <w:proofErr w:type="spellEnd"/>
+      <w:r>
+        <w:rPr>
+          <w:rFonts w:ascii="Cascadia Mono" w:hAnsi="Cascadia Mono" w:cs="Cascadia Mono"/>
+          <w:color w:val="000000"/>
+          <w:sz w:val="19"/>
+          <w:szCs w:val="19"/>
+        </w:rPr>
+        <w:t xml:space="preserve"> </w:t>
+      </w:r>
+      <w:proofErr w:type="spellStart"/>
+      <w:r>
+        <w:rPr>
+          <w:rFonts w:ascii="Cascadia Mono" w:hAnsi="Cascadia Mono" w:cs="Cascadia Mono"/>
+          <w:color w:val="000000"/>
+          <w:sz w:val="19"/>
+          <w:szCs w:val="19"/>
+        </w:rPr>
+        <w:t>distanceY</w:t>
+      </w:r>
+      <w:proofErr w:type="spellEnd"/>
+      <w:r>
+        <w:rPr>
+          <w:rFonts w:ascii="Cascadia Mono" w:hAnsi="Cascadia Mono" w:cs="Cascadia Mono"/>
+          <w:color w:val="000000"/>
+          <w:sz w:val="19"/>
+          <w:szCs w:val="19"/>
+        </w:rPr>
+        <w:t xml:space="preserve"> = y1 - y0;</w:t>
+      </w:r>
+    </w:p>
+    <w:p>
+      <w:pPr>
+        <w:autoSpaceDE w:val="0"/>
+        <w:autoSpaceDN w:val="0"/>
+        <w:adjustRightInd w:val="0"/>
+        <w:spacing w:after="0" w:line="240" w:lineRule="auto"/>
+        <w:rPr>
+          <w:rFonts w:ascii="Cascadia Mono" w:hAnsi="Cascadia Mono" w:cs="Cascadia Mono"/>
+          <w:color w:val="000000"/>
+          <w:sz w:val="19"/>
+          <w:szCs w:val="19"/>
+        </w:rPr>
+      </w:pPr>
+    </w:p>
+    <w:p>
+      <w:pPr>
+        <w:autoSpaceDE w:val="0"/>
+        <w:autoSpaceDN w:val="0"/>
+        <w:adjustRightInd w:val="0"/>
+        <w:spacing w:after="0" w:line="240" w:lineRule="auto"/>
+        <w:rPr>
+          <w:rFonts w:ascii="Cascadia Mono" w:hAnsi="Cascadia Mono" w:cs="Cascadia Mono"/>
+          <w:color w:val="000000"/>
+          <w:sz w:val="19"/>
+          <w:szCs w:val="19"/>
+        </w:rPr>
+      </w:pPr>
+      <w:r>
+        <w:rPr>
+          <w:rFonts w:ascii="Cascadia Mono" w:hAnsi="Cascadia Mono" w:cs="Cascadia Mono"/>
+          <w:color w:val="000000"/>
+          <w:sz w:val="19"/>
+          <w:szCs w:val="19"/>
+        </w:rPr>
+        <w:t xml:space="preserve">    </w:t>
+      </w:r>
+      <w:proofErr w:type="spellStart"/>
+      <w:r>
+        <w:rPr>
+          <w:rFonts w:ascii="Cascadia Mono" w:hAnsi="Cascadia Mono" w:cs="Cascadia Mono"/>
+          <w:color w:val="0000FF"/>
+          <w:sz w:val="19"/>
+          <w:szCs w:val="19"/>
+        </w:rPr>
+        <w:t>int</w:t>
+      </w:r>
+      <w:proofErr w:type="spellEnd"/>
+      <w:r>
+        <w:rPr>
+          <w:rFonts w:ascii="Cascadia Mono" w:hAnsi="Cascadia Mono" w:cs="Cascadia Mono"/>
+          <w:color w:val="000000"/>
+          <w:sz w:val="19"/>
+          <w:szCs w:val="19"/>
+        </w:rPr>
+        <w:t xml:space="preserve"> </w:t>
+      </w:r>
+      <w:proofErr w:type="spellStart"/>
+      <w:r>
+        <w:rPr>
+          <w:rFonts w:ascii="Cascadia Mono" w:hAnsi="Cascadia Mono" w:cs="Cascadia Mono"/>
+          <w:color w:val="000000"/>
+          <w:sz w:val="19"/>
+          <w:szCs w:val="19"/>
+        </w:rPr>
+        <w:t>distance</w:t>
+      </w:r>
+      <w:proofErr w:type="spellEnd"/>
+      <w:r>
+        <w:rPr>
+          <w:rFonts w:ascii="Cascadia Mono" w:hAnsi="Cascadia Mono" w:cs="Cascadia Mono"/>
+          <w:color w:val="000000"/>
+          <w:sz w:val="19"/>
+          <w:szCs w:val="19"/>
+        </w:rPr>
+        <w:t xml:space="preserve"> = </w:t>
+      </w:r>
+      <w:proofErr w:type="spellStart"/>
+      <w:r>
+        <w:rPr>
+          <w:rFonts w:ascii="Cascadia Mono" w:hAnsi="Cascadia Mono" w:cs="Cascadia Mono"/>
+          <w:color w:val="000000"/>
+          <w:sz w:val="19"/>
+          <w:szCs w:val="19"/>
+        </w:rPr>
+        <w:t>Math.Max</w:t>
+      </w:r>
+      <w:proofErr w:type="spellEnd"/>
+      <w:r>
+        <w:rPr>
+          <w:rFonts w:ascii="Cascadia Mono" w:hAnsi="Cascadia Mono" w:cs="Cascadia Mono"/>
+          <w:color w:val="000000"/>
+          <w:sz w:val="19"/>
+          <w:szCs w:val="19"/>
+        </w:rPr>
+        <w:t>(</w:t>
+      </w:r>
+      <w:proofErr w:type="spellStart"/>
+      <w:r>
+        <w:rPr>
+          <w:rFonts w:ascii="Cascadia Mono" w:hAnsi="Cascadia Mono" w:cs="Cascadia Mono"/>
+          <w:color w:val="000000"/>
+          <w:sz w:val="19"/>
+          <w:szCs w:val="19"/>
+        </w:rPr>
+        <w:t>Math.Abs</w:t>
+      </w:r>
+      <w:proofErr w:type="spellEnd"/>
+      <w:r>
+        <w:rPr>
+          <w:rFonts w:ascii="Cascadia Mono" w:hAnsi="Cascadia Mono" w:cs="Cascadia Mono"/>
+          <w:color w:val="000000"/>
+          <w:sz w:val="19"/>
+          <w:szCs w:val="19"/>
+        </w:rPr>
+        <w:t>(</w:t>
+      </w:r>
+      <w:proofErr w:type="spellStart"/>
+      <w:r>
+        <w:rPr>
+          <w:rFonts w:ascii="Cascadia Mono" w:hAnsi="Cascadia Mono" w:cs="Cascadia Mono"/>
+          <w:color w:val="000000"/>
+          <w:sz w:val="19"/>
+          <w:szCs w:val="19"/>
+        </w:rPr>
+        <w:t>distanceX</w:t>
+      </w:r>
+      <w:proofErr w:type="spellEnd"/>
+      <w:r>
+        <w:rPr>
+          <w:rFonts w:ascii="Cascadia Mono" w:hAnsi="Cascadia Mono" w:cs="Cascadia Mono"/>
+          <w:color w:val="000000"/>
+          <w:sz w:val="19"/>
+          <w:szCs w:val="19"/>
+        </w:rPr>
+        <w:t xml:space="preserve">), </w:t>
+      </w:r>
+      <w:proofErr w:type="spellStart"/>
+      <w:r>
+        <w:rPr>
+          <w:rFonts w:ascii="Cascadia Mono" w:hAnsi="Cascadia Mono" w:cs="Cascadia Mono"/>
+          <w:color w:val="000000"/>
+          <w:sz w:val="19"/>
+          <w:szCs w:val="19"/>
+        </w:rPr>
+        <w:t>Math.Abs</w:t>
+      </w:r>
+      <w:proofErr w:type="spellEnd"/>
+      <w:r>
+        <w:rPr>
+          <w:rFonts w:ascii="Cascadia Mono" w:hAnsi="Cascadia Mono" w:cs="Cascadia Mono"/>
+          <w:color w:val="000000"/>
+          <w:sz w:val="19"/>
+          <w:szCs w:val="19"/>
+        </w:rPr>
+        <w:t>(</w:t>
+      </w:r>
+      <w:proofErr w:type="spellStart"/>
+      <w:r>
+        <w:rPr>
+          <w:rFonts w:ascii="Cascadia Mono" w:hAnsi="Cascadia Mono" w:cs="Cascadia Mono"/>
+          <w:color w:val="000000"/>
+          <w:sz w:val="19"/>
+          <w:szCs w:val="19"/>
+        </w:rPr>
+        <w:t>distanceY</w:t>
+      </w:r>
+      <w:proofErr w:type="spellEnd"/>
+      <w:r>
+        <w:rPr>
+          <w:rFonts w:ascii="Cascadia Mono" w:hAnsi="Cascadia Mono" w:cs="Cascadia Mono"/>
+          <w:color w:val="000000"/>
+          <w:sz w:val="19"/>
+          <w:szCs w:val="19"/>
+        </w:rPr>
+        <w:t>));</w:t>
+      </w:r>
+    </w:p>
+    <w:p>
+      <w:pPr>
+        <w:autoSpaceDE w:val="0"/>
+        <w:autoSpaceDN w:val="0"/>
+        <w:adjustRightInd w:val="0"/>
+        <w:spacing w:after="0" w:line="240" w:lineRule="auto"/>
+        <w:rPr>
+          <w:rFonts w:ascii="Cascadia Mono" w:hAnsi="Cascadia Mono" w:cs="Cascadia Mono"/>
+          <w:color w:val="000000"/>
+          <w:sz w:val="19"/>
+          <w:szCs w:val="19"/>
+        </w:rPr>
+      </w:pPr>
+    </w:p>
+    <w:p>
+      <w:pPr>
+        <w:autoSpaceDE w:val="0"/>
+        <w:autoSpaceDN w:val="0"/>
+        <w:adjustRightInd w:val="0"/>
+        <w:spacing w:after="0" w:line="240" w:lineRule="auto"/>
+        <w:rPr>
+          <w:rFonts w:ascii="Cascadia Mono" w:hAnsi="Cascadia Mono" w:cs="Cascadia Mono"/>
+          <w:color w:val="000000"/>
+          <w:sz w:val="19"/>
+          <w:szCs w:val="19"/>
+        </w:rPr>
+      </w:pPr>
+      <w:r>
+        <w:rPr>
+          <w:rFonts w:ascii="Cascadia Mono" w:hAnsi="Cascadia Mono" w:cs="Cascadia Mono"/>
+          <w:color w:val="000000"/>
+          <w:sz w:val="19"/>
+          <w:szCs w:val="19"/>
+        </w:rPr>
+        <w:t xml:space="preserve">    </w:t>
+      </w:r>
+      <w:proofErr w:type="spellStart"/>
+      <w:r>
+        <w:rPr>
+          <w:rFonts w:ascii="Cascadia Mono" w:hAnsi="Cascadia Mono" w:cs="Cascadia Mono"/>
+          <w:color w:val="0000FF"/>
+          <w:sz w:val="19"/>
+          <w:szCs w:val="19"/>
+        </w:rPr>
+        <w:t>int</w:t>
+      </w:r>
+      <w:proofErr w:type="spellEnd"/>
+      <w:r>
+        <w:rPr>
+          <w:rFonts w:ascii="Cascadia Mono" w:hAnsi="Cascadia Mono" w:cs="Cascadia Mono"/>
+          <w:color w:val="000000"/>
+          <w:sz w:val="19"/>
+          <w:szCs w:val="19"/>
+        </w:rPr>
+        <w:t xml:space="preserve"> </w:t>
+      </w:r>
+      <w:proofErr w:type="spellStart"/>
+      <w:r>
+        <w:rPr>
+          <w:rFonts w:ascii="Cascadia Mono" w:hAnsi="Cascadia Mono" w:cs="Cascadia Mono"/>
+          <w:color w:val="000000"/>
+          <w:sz w:val="19"/>
+          <w:szCs w:val="19"/>
+        </w:rPr>
+        <w:t>roundOffsetX</w:t>
+      </w:r>
+      <w:proofErr w:type="spellEnd"/>
+      <w:r>
+        <w:rPr>
+          <w:rFonts w:ascii="Cascadia Mono" w:hAnsi="Cascadia Mono" w:cs="Cascadia Mono"/>
+          <w:color w:val="000000"/>
+          <w:sz w:val="19"/>
+          <w:szCs w:val="19"/>
+        </w:rPr>
+        <w:t xml:space="preserve"> = </w:t>
+      </w:r>
+      <w:proofErr w:type="spellStart"/>
+      <w:r>
+        <w:rPr>
+          <w:rFonts w:ascii="Cascadia Mono" w:hAnsi="Cascadia Mono" w:cs="Cascadia Mono"/>
+          <w:color w:val="000000"/>
+          <w:sz w:val="19"/>
+          <w:szCs w:val="19"/>
+        </w:rPr>
+        <w:t>distanceX</w:t>
+      </w:r>
+      <w:proofErr w:type="spellEnd"/>
+      <w:r>
+        <w:rPr>
+          <w:rFonts w:ascii="Cascadia Mono" w:hAnsi="Cascadia Mono" w:cs="Cascadia Mono"/>
+          <w:color w:val="000000"/>
+          <w:sz w:val="19"/>
+          <w:szCs w:val="19"/>
+        </w:rPr>
+        <w:t xml:space="preserve"> &gt;= </w:t>
+      </w:r>
+      <w:proofErr w:type="gramStart"/>
+      <w:r>
+        <w:rPr>
+          <w:rFonts w:ascii="Cascadia Mono" w:hAnsi="Cascadia Mono" w:cs="Cascadia Mono"/>
+          <w:color w:val="000000"/>
+          <w:sz w:val="19"/>
+          <w:szCs w:val="19"/>
+        </w:rPr>
+        <w:t>0 ?</w:t>
+      </w:r>
+      <w:proofErr w:type="gramEnd"/>
+      <w:r>
+        <w:rPr>
+          <w:rFonts w:ascii="Cascadia Mono" w:hAnsi="Cascadia Mono" w:cs="Cascadia Mono"/>
+          <w:color w:val="000000"/>
+          <w:sz w:val="19"/>
+          <w:szCs w:val="19"/>
+        </w:rPr>
+        <w:t xml:space="preserve"> </w:t>
+      </w:r>
+      <w:proofErr w:type="spellStart"/>
+      <w:r>
+        <w:rPr>
+          <w:rFonts w:ascii="Cascadia Mono" w:hAnsi="Cascadia Mono" w:cs="Cascadia Mono"/>
+          <w:color w:val="000000"/>
+          <w:sz w:val="19"/>
+          <w:szCs w:val="19"/>
+        </w:rPr>
+        <w:t>distance</w:t>
+      </w:r>
+      <w:proofErr w:type="spellEnd"/>
+      <w:r>
+        <w:rPr>
+          <w:rFonts w:ascii="Cascadia Mono" w:hAnsi="Cascadia Mono" w:cs="Cascadia Mono"/>
+          <w:color w:val="000000"/>
+          <w:sz w:val="19"/>
+          <w:szCs w:val="19"/>
+        </w:rPr>
+        <w:t xml:space="preserve"> / 2 : -</w:t>
+      </w:r>
+      <w:proofErr w:type="spellStart"/>
+      <w:r>
+        <w:rPr>
+          <w:rFonts w:ascii="Cascadia Mono" w:hAnsi="Cascadia Mono" w:cs="Cascadia Mono"/>
+          <w:color w:val="000000"/>
+          <w:sz w:val="19"/>
+          <w:szCs w:val="19"/>
+        </w:rPr>
+        <w:t>distance</w:t>
+      </w:r>
+      <w:proofErr w:type="spellEnd"/>
+      <w:r>
+        <w:rPr>
+          <w:rFonts w:ascii="Cascadia Mono" w:hAnsi="Cascadia Mono" w:cs="Cascadia Mono"/>
+          <w:color w:val="000000"/>
+          <w:sz w:val="19"/>
+          <w:szCs w:val="19"/>
+        </w:rPr>
+        <w:t xml:space="preserve"> / 2;</w:t>
+      </w:r>
+    </w:p>
+    <w:p>
+      <w:pPr>
+        <w:autoSpaceDE w:val="0"/>
+        <w:autoSpaceDN w:val="0"/>
+        <w:adjustRightInd w:val="0"/>
+        <w:spacing w:after="0" w:line="240" w:lineRule="auto"/>
+        <w:rPr>
+          <w:rFonts w:ascii="Cascadia Mono" w:hAnsi="Cascadia Mono" w:cs="Cascadia Mono"/>
+          <w:color w:val="000000"/>
+          <w:sz w:val="19"/>
+          <w:szCs w:val="19"/>
+        </w:rPr>
+      </w:pPr>
+      <w:r>
+        <w:rPr>
+          <w:rFonts w:ascii="Cascadia Mono" w:hAnsi="Cascadia Mono" w:cs="Cascadia Mono"/>
+          <w:color w:val="000000"/>
+          <w:sz w:val="19"/>
+          <w:szCs w:val="19"/>
+        </w:rPr>
+        <w:t xml:space="preserve">    </w:t>
+      </w:r>
+      <w:proofErr w:type="spellStart"/>
+      <w:r>
+        <w:rPr>
+          <w:rFonts w:ascii="Cascadia Mono" w:hAnsi="Cascadia Mono" w:cs="Cascadia Mono"/>
+          <w:color w:val="0000FF"/>
+          <w:sz w:val="19"/>
+          <w:szCs w:val="19"/>
+        </w:rPr>
+        <w:t>int</w:t>
+      </w:r>
+      <w:proofErr w:type="spellEnd"/>
+      <w:r>
+        <w:rPr>
+          <w:rFonts w:ascii="Cascadia Mono" w:hAnsi="Cascadia Mono" w:cs="Cascadia Mono"/>
+          <w:color w:val="000000"/>
+          <w:sz w:val="19"/>
+          <w:szCs w:val="19"/>
+        </w:rPr>
+        <w:t xml:space="preserve"> </w:t>
+      </w:r>
+      <w:proofErr w:type="spellStart"/>
+      <w:r>
+        <w:rPr>
+          <w:rFonts w:ascii="Cascadia Mono" w:hAnsi="Cascadia Mono" w:cs="Cascadia Mono"/>
+          <w:color w:val="000000"/>
+          <w:sz w:val="19"/>
+          <w:szCs w:val="19"/>
+        </w:rPr>
+        <w:t>roundOffsetY</w:t>
+      </w:r>
+      <w:proofErr w:type="spellEnd"/>
+      <w:r>
+        <w:rPr>
+          <w:rFonts w:ascii="Cascadia Mono" w:hAnsi="Cascadia Mono" w:cs="Cascadia Mono"/>
+          <w:color w:val="000000"/>
+          <w:sz w:val="19"/>
+          <w:szCs w:val="19"/>
+        </w:rPr>
+        <w:t xml:space="preserve"> = </w:t>
+      </w:r>
+      <w:proofErr w:type="spellStart"/>
+      <w:r>
+        <w:rPr>
+          <w:rFonts w:ascii="Cascadia Mono" w:hAnsi="Cascadia Mono" w:cs="Cascadia Mono"/>
+          <w:color w:val="000000"/>
+          <w:sz w:val="19"/>
+          <w:szCs w:val="19"/>
+        </w:rPr>
+        <w:t>distanceY</w:t>
+      </w:r>
+      <w:proofErr w:type="spellEnd"/>
+      <w:r>
+        <w:rPr>
+          <w:rFonts w:ascii="Cascadia Mono" w:hAnsi="Cascadia Mono" w:cs="Cascadia Mono"/>
+          <w:color w:val="000000"/>
+          <w:sz w:val="19"/>
+          <w:szCs w:val="19"/>
+        </w:rPr>
+        <w:t xml:space="preserve"> &gt;= </w:t>
+      </w:r>
+      <w:proofErr w:type="gramStart"/>
+      <w:r>
+        <w:rPr>
+          <w:rFonts w:ascii="Cascadia Mono" w:hAnsi="Cascadia Mono" w:cs="Cascadia Mono"/>
+          <w:color w:val="000000"/>
+          <w:sz w:val="19"/>
+          <w:szCs w:val="19"/>
+        </w:rPr>
+        <w:t>0 ?</w:t>
+      </w:r>
+      <w:proofErr w:type="gramEnd"/>
+      <w:r>
+        <w:rPr>
+          <w:rFonts w:ascii="Cascadia Mono" w:hAnsi="Cascadia Mono" w:cs="Cascadia Mono"/>
+          <w:color w:val="000000"/>
+          <w:sz w:val="19"/>
+          <w:szCs w:val="19"/>
+        </w:rPr>
+        <w:t xml:space="preserve"> </w:t>
+      </w:r>
+      <w:proofErr w:type="spellStart"/>
+      <w:r>
+        <w:rPr>
+          <w:rFonts w:ascii="Cascadia Mono" w:hAnsi="Cascadia Mono" w:cs="Cascadia Mono"/>
+          <w:color w:val="000000"/>
+          <w:sz w:val="19"/>
+          <w:szCs w:val="19"/>
+        </w:rPr>
+        <w:t>distance</w:t>
+      </w:r>
+      <w:proofErr w:type="spellEnd"/>
+      <w:r>
+        <w:rPr>
+          <w:rFonts w:ascii="Cascadia Mono" w:hAnsi="Cascadia Mono" w:cs="Cascadia Mono"/>
+          <w:color w:val="000000"/>
+          <w:sz w:val="19"/>
+          <w:szCs w:val="19"/>
+        </w:rPr>
+        <w:t xml:space="preserve"> / 2 : -</w:t>
+      </w:r>
+      <w:proofErr w:type="spellStart"/>
+      <w:r>
+        <w:rPr>
+          <w:rFonts w:ascii="Cascadia Mono" w:hAnsi="Cascadia Mono" w:cs="Cascadia Mono"/>
+          <w:color w:val="000000"/>
+          <w:sz w:val="19"/>
+          <w:szCs w:val="19"/>
+        </w:rPr>
+        <w:t>distance</w:t>
+      </w:r>
+      <w:proofErr w:type="spellEnd"/>
+      <w:r>
+        <w:rPr>
+          <w:rFonts w:ascii="Cascadia Mono" w:hAnsi="Cascadia Mono" w:cs="Cascadia Mono"/>
+          <w:color w:val="000000"/>
+          <w:sz w:val="19"/>
+          <w:szCs w:val="19"/>
+        </w:rPr>
+        <w:t xml:space="preserve"> / 2;</w:t>
+      </w:r>
+    </w:p>
+    <w:p>
+      <w:pPr>
+        <w:autoSpaceDE w:val="0"/>
+        <w:autoSpaceDN w:val="0"/>
+        <w:adjustRightInd w:val="0"/>
+        <w:spacing w:after="0" w:line="240" w:lineRule="auto"/>
+        <w:rPr>
+          <w:rFonts w:ascii="Cascadia Mono" w:hAnsi="Cascadia Mono" w:cs="Cascadia Mono"/>
+          <w:color w:val="000000"/>
+          <w:sz w:val="19"/>
+          <w:szCs w:val="19"/>
+        </w:rPr>
+      </w:pPr>
+    </w:p>
+    <w:p>
+      <w:pPr>
+        <w:autoSpaceDE w:val="0"/>
+        <w:autoSpaceDN w:val="0"/>
+        <w:adjustRightInd w:val="0"/>
+        <w:spacing w:after="0" w:line="240" w:lineRule="auto"/>
+        <w:rPr>
+          <w:rFonts w:ascii="Cascadia Mono" w:hAnsi="Cascadia Mono" w:cs="Cascadia Mono"/>
+          <w:color w:val="000000"/>
+          <w:sz w:val="19"/>
+          <w:szCs w:val="19"/>
+        </w:rPr>
+      </w:pPr>
+      <w:r>
+        <w:rPr>
+          <w:rFonts w:ascii="Cascadia Mono" w:hAnsi="Cascadia Mono" w:cs="Cascadia Mono"/>
+          <w:color w:val="000000"/>
+          <w:sz w:val="19"/>
+          <w:szCs w:val="19"/>
+        </w:rPr>
+        <w:t xml:space="preserve">    </w:t>
+      </w:r>
+      <w:proofErr w:type="spellStart"/>
+      <w:r>
+        <w:rPr>
+          <w:rFonts w:ascii="Cascadia Mono" w:hAnsi="Cascadia Mono" w:cs="Cascadia Mono"/>
+          <w:color w:val="0000FF"/>
+          <w:sz w:val="19"/>
+          <w:szCs w:val="19"/>
+        </w:rPr>
+        <w:t>for</w:t>
+      </w:r>
+      <w:proofErr w:type="spellEnd"/>
+      <w:r>
+        <w:rPr>
+          <w:rFonts w:ascii="Cascadia Mono" w:hAnsi="Cascadia Mono" w:cs="Cascadia Mono"/>
+          <w:color w:val="000000"/>
+          <w:sz w:val="19"/>
+          <w:szCs w:val="19"/>
+        </w:rPr>
+        <w:t xml:space="preserve"> (</w:t>
+      </w:r>
+      <w:proofErr w:type="spellStart"/>
+      <w:r>
+        <w:rPr>
+          <w:rFonts w:ascii="Cascadia Mono" w:hAnsi="Cascadia Mono" w:cs="Cascadia Mono"/>
+          <w:color w:val="0000FF"/>
+          <w:sz w:val="19"/>
+          <w:szCs w:val="19"/>
+        </w:rPr>
+        <w:t>int</w:t>
+      </w:r>
+      <w:proofErr w:type="spellEnd"/>
+      <w:r>
+        <w:rPr>
+          <w:rFonts w:ascii="Cascadia Mono" w:hAnsi="Cascadia Mono" w:cs="Cascadia Mono"/>
+          <w:color w:val="000000"/>
+          <w:sz w:val="19"/>
+          <w:szCs w:val="19"/>
+        </w:rPr>
+        <w:t xml:space="preserve"> i = 0; i &lt;= </w:t>
+      </w:r>
+      <w:proofErr w:type="spellStart"/>
+      <w:r>
+        <w:rPr>
+          <w:rFonts w:ascii="Cascadia Mono" w:hAnsi="Cascadia Mono" w:cs="Cascadia Mono"/>
+          <w:color w:val="000000"/>
+          <w:sz w:val="19"/>
+          <w:szCs w:val="19"/>
+        </w:rPr>
+        <w:t>distance</w:t>
+      </w:r>
+      <w:proofErr w:type="spellEnd"/>
+      <w:r>
+        <w:rPr>
+          <w:rFonts w:ascii="Cascadia Mono" w:hAnsi="Cascadia Mono" w:cs="Cascadia Mono"/>
+          <w:color w:val="000000"/>
+          <w:sz w:val="19"/>
+          <w:szCs w:val="19"/>
+        </w:rPr>
+        <w:t>; i++)</w:t>
+      </w:r>
+    </w:p>
+    <w:p>
+      <w:pPr>
+        <w:autoSpaceDE w:val="0"/>
+        <w:autoSpaceDN w:val="0"/>
+        <w:adjustRightInd w:val="0"/>
+        <w:spacing w:after="0" w:line="240" w:lineRule="auto"/>
+        <w:rPr>
+          <w:rFonts w:ascii="Cascadia Mono" w:hAnsi="Cascadia Mono" w:cs="Cascadia Mono"/>
+          <w:color w:val="000000"/>
+          <w:sz w:val="19"/>
+          <w:szCs w:val="19"/>
+        </w:rPr>
+      </w:pPr>
+      <w:r>
+        <w:rPr>
+          <w:rFonts w:ascii="Cascadia Mono" w:hAnsi="Cascadia Mono" w:cs="Cascadia Mono"/>
+          <w:color w:val="000000"/>
+          <w:sz w:val="19"/>
+          <w:szCs w:val="19"/>
+        </w:rPr>
+        <w:t xml:space="preserve">    {</w:t>
+      </w:r>
+    </w:p>
+    <w:p>
+      <w:pPr>
+        <w:autoSpaceDE w:val="0"/>
+        <w:autoSpaceDN w:val="0"/>
+        <w:adjustRightInd w:val="0"/>
+        <w:spacing w:after="0" w:line="240" w:lineRule="auto"/>
+        <w:rPr>
+          <w:rFonts w:ascii="Cascadia Mono" w:hAnsi="Cascadia Mono" w:cs="Cascadia Mono"/>
+          <w:color w:val="000000"/>
+          <w:sz w:val="19"/>
+          <w:szCs w:val="19"/>
+        </w:rPr>
+      </w:pPr>
+      <w:r>
+        <w:rPr>
+          <w:rFonts w:ascii="Cascadia Mono" w:hAnsi="Cascadia Mono" w:cs="Cascadia Mono"/>
+          <w:color w:val="000000"/>
+          <w:sz w:val="19"/>
+          <w:szCs w:val="19"/>
+        </w:rPr>
+        <w:t xml:space="preserve">        </w:t>
+      </w:r>
+      <w:proofErr w:type="spellStart"/>
+      <w:r>
+        <w:rPr>
+          <w:rFonts w:ascii="Cascadia Mono" w:hAnsi="Cascadia Mono" w:cs="Cascadia Mono"/>
+          <w:color w:val="0000FF"/>
+          <w:sz w:val="19"/>
+          <w:szCs w:val="19"/>
+        </w:rPr>
+        <w:t>int</w:t>
+      </w:r>
+      <w:proofErr w:type="spellEnd"/>
+      <w:r>
+        <w:rPr>
+          <w:rFonts w:ascii="Cascadia Mono" w:hAnsi="Cascadia Mono" w:cs="Cascadia Mono"/>
+          <w:color w:val="000000"/>
+          <w:sz w:val="19"/>
+          <w:szCs w:val="19"/>
+        </w:rPr>
+        <w:t xml:space="preserve"> x = x0 + (i * </w:t>
+      </w:r>
+      <w:proofErr w:type="spellStart"/>
+      <w:r>
+        <w:rPr>
+          <w:rFonts w:ascii="Cascadia Mono" w:hAnsi="Cascadia Mono" w:cs="Cascadia Mono"/>
+          <w:color w:val="000000"/>
+          <w:sz w:val="19"/>
+          <w:szCs w:val="19"/>
+        </w:rPr>
+        <w:t>distanceX</w:t>
+      </w:r>
+      <w:proofErr w:type="spellEnd"/>
+      <w:r>
+        <w:rPr>
+          <w:rFonts w:ascii="Cascadia Mono" w:hAnsi="Cascadia Mono" w:cs="Cascadia Mono"/>
+          <w:color w:val="000000"/>
+          <w:sz w:val="19"/>
+          <w:szCs w:val="19"/>
+        </w:rPr>
+        <w:t xml:space="preserve"> + </w:t>
+      </w:r>
+      <w:proofErr w:type="spellStart"/>
+      <w:r>
+        <w:rPr>
+          <w:rFonts w:ascii="Cascadia Mono" w:hAnsi="Cascadia Mono" w:cs="Cascadia Mono"/>
+          <w:color w:val="000000"/>
+          <w:sz w:val="19"/>
+          <w:szCs w:val="19"/>
+        </w:rPr>
+        <w:t>roundOffsetX</w:t>
+      </w:r>
+      <w:proofErr w:type="spellEnd"/>
+      <w:r>
+        <w:rPr>
+          <w:rFonts w:ascii="Cascadia Mono" w:hAnsi="Cascadia Mono" w:cs="Cascadia Mono"/>
+          <w:color w:val="000000"/>
+          <w:sz w:val="19"/>
+          <w:szCs w:val="19"/>
+        </w:rPr>
+        <w:t xml:space="preserve">) / </w:t>
+      </w:r>
+      <w:proofErr w:type="spellStart"/>
+      <w:r>
+        <w:rPr>
+          <w:rFonts w:ascii="Cascadia Mono" w:hAnsi="Cascadia Mono" w:cs="Cascadia Mono"/>
+          <w:color w:val="000000"/>
+          <w:sz w:val="19"/>
+          <w:szCs w:val="19"/>
+        </w:rPr>
+        <w:t>distance</w:t>
+      </w:r>
+      <w:proofErr w:type="spellEnd"/>
+      <w:r>
+        <w:rPr>
+          <w:rFonts w:ascii="Cascadia Mono" w:hAnsi="Cascadia Mono" w:cs="Cascadia Mono"/>
+          <w:color w:val="000000"/>
+          <w:sz w:val="19"/>
+          <w:szCs w:val="19"/>
+        </w:rPr>
+        <w:t>;</w:t>
+      </w:r>
+    </w:p>
+    <w:p>
+      <w:pPr>
+        <w:autoSpaceDE w:val="0"/>
+        <w:autoSpaceDN w:val="0"/>
+        <w:adjustRightInd w:val="0"/>
+        <w:spacing w:after="0" w:line="240" w:lineRule="auto"/>
+        <w:rPr>
+          <w:rFonts w:ascii="Cascadia Mono" w:hAnsi="Cascadia Mono" w:cs="Cascadia Mono"/>
+          <w:color w:val="000000"/>
+          <w:sz w:val="19"/>
+          <w:szCs w:val="19"/>
+        </w:rPr>
+      </w:pPr>
+      <w:r>
+        <w:rPr>
+          <w:rFonts w:ascii="Cascadia Mono" w:hAnsi="Cascadia Mono" w:cs="Cascadia Mono"/>
+          <w:color w:val="000000"/>
+          <w:sz w:val="19"/>
+          <w:szCs w:val="19"/>
+        </w:rPr>
+        <w:t xml:space="preserve">        </w:t>
+      </w:r>
+      <w:proofErr w:type="spellStart"/>
+      <w:r>
+        <w:rPr>
+          <w:rFonts w:ascii="Cascadia Mono" w:hAnsi="Cascadia Mono" w:cs="Cascadia Mono"/>
+          <w:color w:val="0000FF"/>
+          <w:sz w:val="19"/>
+          <w:szCs w:val="19"/>
+        </w:rPr>
+        <w:t>int</w:t>
+      </w:r>
+      <w:proofErr w:type="spellEnd"/>
+      <w:r>
+        <w:rPr>
+          <w:rFonts w:ascii="Cascadia Mono" w:hAnsi="Cascadia Mono" w:cs="Cascadia Mono"/>
+          <w:color w:val="000000"/>
+          <w:sz w:val="19"/>
+          <w:szCs w:val="19"/>
+        </w:rPr>
+        <w:t xml:space="preserve"> y = y0 + (i * </w:t>
+      </w:r>
+      <w:proofErr w:type="spellStart"/>
+      <w:r>
+        <w:rPr>
+          <w:rFonts w:ascii="Cascadia Mono" w:hAnsi="Cascadia Mono" w:cs="Cascadia Mono"/>
+          <w:color w:val="000000"/>
+          <w:sz w:val="19"/>
+          <w:szCs w:val="19"/>
+        </w:rPr>
+        <w:t>distanceY</w:t>
+      </w:r>
+      <w:proofErr w:type="spellEnd"/>
+      <w:r>
+        <w:rPr>
+          <w:rFonts w:ascii="Cascadia Mono" w:hAnsi="Cascadia Mono" w:cs="Cascadia Mono"/>
+          <w:color w:val="000000"/>
+          <w:sz w:val="19"/>
+          <w:szCs w:val="19"/>
+        </w:rPr>
+        <w:t xml:space="preserve"> + </w:t>
+      </w:r>
+      <w:proofErr w:type="spellStart"/>
+      <w:r>
+        <w:rPr>
+          <w:rFonts w:ascii="Cascadia Mono" w:hAnsi="Cascadia Mono" w:cs="Cascadia Mono"/>
+          <w:color w:val="000000"/>
+          <w:sz w:val="19"/>
+          <w:szCs w:val="19"/>
+        </w:rPr>
+        <w:t>roundOffsetY</w:t>
+      </w:r>
+      <w:proofErr w:type="spellEnd"/>
+      <w:r>
+        <w:rPr>
+          <w:rFonts w:ascii="Cascadia Mono" w:hAnsi="Cascadia Mono" w:cs="Cascadia Mono"/>
+          <w:color w:val="000000"/>
+          <w:sz w:val="19"/>
+          <w:szCs w:val="19"/>
+        </w:rPr>
+        <w:t xml:space="preserve">) / </w:t>
+      </w:r>
+      <w:proofErr w:type="spellStart"/>
+      <w:r>
+        <w:rPr>
+          <w:rFonts w:ascii="Cascadia Mono" w:hAnsi="Cascadia Mono" w:cs="Cascadia Mono"/>
+          <w:color w:val="000000"/>
+          <w:sz w:val="19"/>
+          <w:szCs w:val="19"/>
+        </w:rPr>
+        <w:t>distance</w:t>
+      </w:r>
+      <w:proofErr w:type="spellEnd"/>
+      <w:r>
+        <w:rPr>
+          <w:rFonts w:ascii="Cascadia Mono" w:hAnsi="Cascadia Mono" w:cs="Cascadia Mono"/>
+          <w:color w:val="000000"/>
+          <w:sz w:val="19"/>
+          <w:szCs w:val="19"/>
+        </w:rPr>
+        <w:t>;</w:t>
+      </w:r>
+    </w:p>
+    <w:p>
+      <w:pPr>
+        <w:autoSpaceDE w:val="0"/>
+        <w:autoSpaceDN w:val="0"/>
+        <w:adjustRightInd w:val="0"/>
+        <w:spacing w:after="0" w:line="240" w:lineRule="auto"/>
+        <w:rPr>
+          <w:rFonts w:ascii="Cascadia Mono" w:hAnsi="Cascadia Mono" w:cs="Cascadia Mono"/>
+          <w:color w:val="000000"/>
+          <w:sz w:val="19"/>
+          <w:szCs w:val="19"/>
+        </w:rPr>
+      </w:pPr>
+      <w:r>
+        <w:rPr>
+          <w:rFonts w:ascii="Cascadia Mono" w:hAnsi="Cascadia Mono" w:cs="Cascadia Mono"/>
+          <w:color w:val="000000"/>
+          <w:sz w:val="19"/>
+          <w:szCs w:val="19"/>
+        </w:rPr>
+        <w:t xml:space="preserve">        </w:t>
+      </w:r>
+      <w:proofErr w:type="spellStart"/>
+      <w:proofErr w:type="gramStart"/>
+      <w:r>
+        <w:rPr>
+          <w:rFonts w:ascii="Cascadia Mono" w:hAnsi="Cascadia Mono" w:cs="Cascadia Mono"/>
+          <w:color w:val="000000"/>
+          <w:sz w:val="19"/>
+          <w:szCs w:val="19"/>
+        </w:rPr>
+        <w:t>DrawDot</w:t>
+      </w:r>
+      <w:proofErr w:type="spellEnd"/>
+      <w:r>
+        <w:rPr>
+          <w:rFonts w:ascii="Cascadia Mono" w:hAnsi="Cascadia Mono" w:cs="Cascadia Mono"/>
+          <w:color w:val="000000"/>
+          <w:sz w:val="19"/>
+          <w:szCs w:val="19"/>
+        </w:rPr>
+        <w:t>(</w:t>
+      </w:r>
+      <w:proofErr w:type="gramEnd"/>
+      <w:r>
+        <w:rPr>
+          <w:rFonts w:ascii="Cascadia Mono" w:hAnsi="Cascadia Mono" w:cs="Cascadia Mono"/>
+          <w:color w:val="000000"/>
+          <w:sz w:val="19"/>
+          <w:szCs w:val="19"/>
+        </w:rPr>
+        <w:t xml:space="preserve">x, y, </w:t>
+      </w:r>
+      <w:proofErr w:type="spellStart"/>
+      <w:r>
+        <w:rPr>
+          <w:rFonts w:ascii="Cascadia Mono" w:hAnsi="Cascadia Mono" w:cs="Cascadia Mono"/>
+          <w:color w:val="000000"/>
+          <w:sz w:val="19"/>
+          <w:szCs w:val="19"/>
+        </w:rPr>
+        <w:t>color</w:t>
+      </w:r>
+      <w:proofErr w:type="spellEnd"/>
+      <w:r>
+        <w:rPr>
+          <w:rFonts w:ascii="Cascadia Mono" w:hAnsi="Cascadia Mono" w:cs="Cascadia Mono"/>
+          <w:color w:val="000000"/>
+          <w:sz w:val="19"/>
+          <w:szCs w:val="19"/>
+        </w:rPr>
+        <w:t>);</w:t>
+      </w:r>
+    </w:p>
+    <w:p>
+      <w:pPr>
+        <w:autoSpaceDE w:val="0"/>
+        <w:autoSpaceDN w:val="0"/>
+        <w:adjustRightInd w:val="0"/>
+        <w:spacing w:after="0" w:line="240" w:lineRule="auto"/>
+        <w:rPr>
+          <w:rFonts w:ascii="Cascadia Mono" w:hAnsi="Cascadia Mono" w:cs="Cascadia Mono"/>
+          <w:color w:val="000000"/>
+          <w:sz w:val="16"/>
+          <w:szCs w:val="16"/>
+        </w:rPr>
+      </w:pPr>
+      <w:r>
+        <w:rPr>
+          <w:rFonts w:ascii="Cascadia Mono" w:hAnsi="Cascadia Mono" w:cs="Cascadia Mono"/>
+          <w:color w:val="000000"/>
+          <w:sz w:val="19"/>
+          <w:szCs w:val="19"/>
+        </w:rPr>
+        <w:t xml:space="preserve">    }</w:t>
       </w:r>
     </w:p>
     <w:p>
@@ -368,456 +1541,6 @@
           <w:szCs w:val="16"/>
         </w:rPr>
       </w:pPr>
-      <w:r>
-        <w:rPr>
-          <w:rFonts w:ascii="Cascadia Mono" w:hAnsi="Cascadia Mono" w:cs="Cascadia Mono"/>
-          <w:color w:val="000000"/>
-          <w:sz w:val="16"/>
-          <w:szCs w:val="16"/>
-        </w:rPr>
-        <w:t xml:space="preserve">    </w:t>
-      </w:r>
-      <w:r>
-        <w:rPr>
-          <w:rFonts w:ascii="Cascadia Mono" w:hAnsi="Cascadia Mono" w:cs="Cascadia Mono"/>
-          <w:color w:val="0000FF"/>
-          <w:sz w:val="16"/>
-          <w:szCs w:val="16"/>
-        </w:rPr>
-        <w:t>int</w:t>
-      </w:r>
-      <w:r>
-        <w:rPr>
-          <w:rFonts w:ascii="Cascadia Mono" w:hAnsi="Cascadia Mono" w:cs="Cascadia Mono"/>
-          <w:color w:val="000000"/>
-          <w:sz w:val="16"/>
-          <w:szCs w:val="16"/>
-        </w:rPr>
-        <w:t xml:space="preserve"> diffX = x1 - x0;</w:t>
-      </w:r>
-    </w:p>
-    <w:p>
-      <w:pPr>
-        <w:autoSpaceDE w:val="0"/>
-        <w:autoSpaceDN w:val="0"/>
-        <w:adjustRightInd w:val="0"/>
-        <w:spacing w:after="0" w:line="240" w:lineRule="auto"/>
-        <w:ind w:left="426"/>
-        <w:rPr>
-          <w:rFonts w:ascii="Cascadia Mono" w:hAnsi="Cascadia Mono" w:cs="Cascadia Mono"/>
-          <w:color w:val="000000"/>
-          <w:sz w:val="16"/>
-          <w:szCs w:val="16"/>
-        </w:rPr>
-      </w:pPr>
-      <w:r>
-        <w:rPr>
-          <w:rFonts w:ascii="Cascadia Mono" w:hAnsi="Cascadia Mono" w:cs="Cascadia Mono"/>
-          <w:color w:val="000000"/>
-          <w:sz w:val="16"/>
-          <w:szCs w:val="16"/>
-        </w:rPr>
-        <w:t xml:space="preserve">    </w:t>
-      </w:r>
-      <w:r>
-        <w:rPr>
-          <w:rFonts w:ascii="Cascadia Mono" w:hAnsi="Cascadia Mono" w:cs="Cascadia Mono"/>
-          <w:color w:val="0000FF"/>
-          <w:sz w:val="16"/>
-          <w:szCs w:val="16"/>
-        </w:rPr>
-        <w:t>int</w:t>
-      </w:r>
-      <w:r>
-        <w:rPr>
-          <w:rFonts w:ascii="Cascadia Mono" w:hAnsi="Cascadia Mono" w:cs="Cascadia Mono"/>
-          <w:color w:val="000000"/>
-          <w:sz w:val="16"/>
-          <w:szCs w:val="16"/>
-        </w:rPr>
-        <w:t xml:space="preserve"> diffY = y1 - y0;</w:t>
-      </w:r>
-    </w:p>
-    <w:p>
-      <w:pPr>
-        <w:autoSpaceDE w:val="0"/>
-        <w:autoSpaceDN w:val="0"/>
-        <w:adjustRightInd w:val="0"/>
-        <w:spacing w:after="0" w:line="240" w:lineRule="auto"/>
-        <w:ind w:left="426"/>
-        <w:rPr>
-          <w:rFonts w:ascii="Cascadia Mono" w:hAnsi="Cascadia Mono" w:cs="Cascadia Mono"/>
-          <w:color w:val="000000"/>
-          <w:sz w:val="16"/>
-          <w:szCs w:val="16"/>
-        </w:rPr>
-      </w:pPr>
-      <w:r>
-        <w:rPr>
-          <w:rFonts w:ascii="Cascadia Mono" w:hAnsi="Cascadia Mono" w:cs="Cascadia Mono"/>
-          <w:color w:val="000000"/>
-          <w:sz w:val="16"/>
-          <w:szCs w:val="16"/>
-        </w:rPr>
-        <w:t xml:space="preserve">    </w:t>
-      </w:r>
-      <w:r>
-        <w:rPr>
-          <w:rFonts w:ascii="Cascadia Mono" w:hAnsi="Cascadia Mono" w:cs="Cascadia Mono"/>
-          <w:color w:val="0000FF"/>
-          <w:sz w:val="16"/>
-          <w:szCs w:val="16"/>
-        </w:rPr>
-        <w:t>int</w:t>
-      </w:r>
-      <w:r>
-        <w:rPr>
-          <w:rFonts w:ascii="Cascadia Mono" w:hAnsi="Cascadia Mono" w:cs="Cascadia Mono"/>
-          <w:color w:val="000000"/>
-          <w:sz w:val="16"/>
-          <w:szCs w:val="16"/>
-        </w:rPr>
-        <w:t xml:space="preserve"> mulX = diffX &gt;= 0 ? 1 : -1;</w:t>
-      </w:r>
-    </w:p>
-    <w:p>
-      <w:pPr>
-        <w:autoSpaceDE w:val="0"/>
-        <w:autoSpaceDN w:val="0"/>
-        <w:adjustRightInd w:val="0"/>
-        <w:spacing w:after="0" w:line="240" w:lineRule="auto"/>
-        <w:ind w:left="426"/>
-        <w:rPr>
-          <w:rFonts w:ascii="Cascadia Mono" w:hAnsi="Cascadia Mono" w:cs="Cascadia Mono"/>
-          <w:color w:val="000000"/>
-          <w:sz w:val="16"/>
-          <w:szCs w:val="16"/>
-        </w:rPr>
-      </w:pPr>
-      <w:r>
-        <w:rPr>
-          <w:rFonts w:ascii="Cascadia Mono" w:hAnsi="Cascadia Mono" w:cs="Cascadia Mono"/>
-          <w:color w:val="000000"/>
-          <w:sz w:val="16"/>
-          <w:szCs w:val="16"/>
-        </w:rPr>
-        <w:t xml:space="preserve">    </w:t>
-      </w:r>
-      <w:r>
-        <w:rPr>
-          <w:rFonts w:ascii="Cascadia Mono" w:hAnsi="Cascadia Mono" w:cs="Cascadia Mono"/>
-          <w:color w:val="0000FF"/>
-          <w:sz w:val="16"/>
-          <w:szCs w:val="16"/>
-        </w:rPr>
-        <w:t>int</w:t>
-      </w:r>
-      <w:r>
-        <w:rPr>
-          <w:rFonts w:ascii="Cascadia Mono" w:hAnsi="Cascadia Mono" w:cs="Cascadia Mono"/>
-          <w:color w:val="000000"/>
-          <w:sz w:val="16"/>
-          <w:szCs w:val="16"/>
-        </w:rPr>
-        <w:t xml:space="preserve"> mulY = diffY &gt;= 0 ? 1 : -1;</w:t>
-      </w:r>
-    </w:p>
-    <w:p>
-      <w:pPr>
-        <w:autoSpaceDE w:val="0"/>
-        <w:autoSpaceDN w:val="0"/>
-        <w:adjustRightInd w:val="0"/>
-        <w:spacing w:after="0" w:line="240" w:lineRule="auto"/>
-        <w:ind w:left="426"/>
-        <w:rPr>
-          <w:rFonts w:ascii="Cascadia Mono" w:hAnsi="Cascadia Mono" w:cs="Cascadia Mono"/>
-          <w:color w:val="000000"/>
-          <w:sz w:val="16"/>
-          <w:szCs w:val="16"/>
-        </w:rPr>
-      </w:pPr>
-    </w:p>
-    <w:p>
-      <w:pPr>
-        <w:autoSpaceDE w:val="0"/>
-        <w:autoSpaceDN w:val="0"/>
-        <w:adjustRightInd w:val="0"/>
-        <w:spacing w:after="0" w:line="240" w:lineRule="auto"/>
-        <w:ind w:left="426"/>
-        <w:rPr>
-          <w:rFonts w:ascii="Cascadia Mono" w:hAnsi="Cascadia Mono" w:cs="Cascadia Mono"/>
-          <w:color w:val="000000"/>
-          <w:sz w:val="16"/>
-          <w:szCs w:val="16"/>
-        </w:rPr>
-      </w:pPr>
-      <w:r>
-        <w:rPr>
-          <w:rFonts w:ascii="Cascadia Mono" w:hAnsi="Cascadia Mono" w:cs="Cascadia Mono"/>
-          <w:color w:val="000000"/>
-          <w:sz w:val="16"/>
-          <w:szCs w:val="16"/>
-        </w:rPr>
-        <w:t xml:space="preserve">    </w:t>
-      </w:r>
-      <w:r>
-        <w:rPr>
-          <w:rFonts w:ascii="Cascadia Mono" w:hAnsi="Cascadia Mono" w:cs="Cascadia Mono"/>
-          <w:color w:val="0000FF"/>
-          <w:sz w:val="16"/>
-          <w:szCs w:val="16"/>
-        </w:rPr>
-        <w:t>int</w:t>
-      </w:r>
-      <w:r>
-        <w:rPr>
-          <w:rFonts w:ascii="Cascadia Mono" w:hAnsi="Cascadia Mono" w:cs="Cascadia Mono"/>
-          <w:color w:val="000000"/>
-          <w:sz w:val="16"/>
-          <w:szCs w:val="16"/>
-        </w:rPr>
-        <w:t xml:space="preserve"> diff = Math.Max(Math.Abs(diffX), Math.Abs(diffY));</w:t>
-      </w:r>
-    </w:p>
-    <w:p>
-      <w:pPr>
-        <w:autoSpaceDE w:val="0"/>
-        <w:autoSpaceDN w:val="0"/>
-        <w:adjustRightInd w:val="0"/>
-        <w:spacing w:after="0" w:line="240" w:lineRule="auto"/>
-        <w:ind w:left="426"/>
-        <w:rPr>
-          <w:rFonts w:ascii="Cascadia Mono" w:hAnsi="Cascadia Mono" w:cs="Cascadia Mono"/>
-          <w:color w:val="000000"/>
-          <w:sz w:val="16"/>
-          <w:szCs w:val="16"/>
-        </w:rPr>
-      </w:pPr>
-    </w:p>
-    <w:p>
-      <w:pPr>
-        <w:autoSpaceDE w:val="0"/>
-        <w:autoSpaceDN w:val="0"/>
-        <w:adjustRightInd w:val="0"/>
-        <w:spacing w:after="0" w:line="240" w:lineRule="auto"/>
-        <w:ind w:left="426"/>
-        <w:rPr>
-          <w:rFonts w:ascii="Cascadia Mono" w:hAnsi="Cascadia Mono" w:cs="Cascadia Mono"/>
-          <w:color w:val="000000"/>
-          <w:sz w:val="16"/>
-          <w:szCs w:val="16"/>
-        </w:rPr>
-      </w:pPr>
-      <w:r>
-        <w:rPr>
-          <w:rFonts w:ascii="Cascadia Mono" w:hAnsi="Cascadia Mono" w:cs="Cascadia Mono"/>
-          <w:color w:val="000000"/>
-          <w:sz w:val="16"/>
-          <w:szCs w:val="16"/>
-        </w:rPr>
-        <w:t xml:space="preserve">    </w:t>
-      </w:r>
-      <w:r>
-        <w:rPr>
-          <w:rFonts w:ascii="Cascadia Mono" w:hAnsi="Cascadia Mono" w:cs="Cascadia Mono"/>
-          <w:color w:val="0000FF"/>
-          <w:sz w:val="16"/>
-          <w:szCs w:val="16"/>
-        </w:rPr>
-        <w:t>for</w:t>
-      </w:r>
-      <w:r>
-        <w:rPr>
-          <w:rFonts w:ascii="Cascadia Mono" w:hAnsi="Cascadia Mono" w:cs="Cascadia Mono"/>
-          <w:color w:val="000000"/>
-          <w:sz w:val="16"/>
-          <w:szCs w:val="16"/>
-        </w:rPr>
-        <w:t xml:space="preserve"> (</w:t>
-      </w:r>
-      <w:r>
-        <w:rPr>
-          <w:rFonts w:ascii="Cascadia Mono" w:hAnsi="Cascadia Mono" w:cs="Cascadia Mono"/>
-          <w:color w:val="0000FF"/>
-          <w:sz w:val="16"/>
-          <w:szCs w:val="16"/>
-        </w:rPr>
-        <w:t>int</w:t>
-      </w:r>
-      <w:r>
-        <w:rPr>
-          <w:rFonts w:ascii="Cascadia Mono" w:hAnsi="Cascadia Mono" w:cs="Cascadia Mono"/>
-          <w:color w:val="000000"/>
-          <w:sz w:val="16"/>
-          <w:szCs w:val="16"/>
-        </w:rPr>
-        <w:t xml:space="preserve"> i = 0; i &lt;= diff; i++)</w:t>
-      </w:r>
-    </w:p>
-    <w:p>
-      <w:pPr>
-        <w:autoSpaceDE w:val="0"/>
-        <w:autoSpaceDN w:val="0"/>
-        <w:adjustRightInd w:val="0"/>
-        <w:spacing w:after="0" w:line="240" w:lineRule="auto"/>
-        <w:ind w:left="426"/>
-        <w:rPr>
-          <w:rFonts w:ascii="Cascadia Mono" w:hAnsi="Cascadia Mono" w:cs="Cascadia Mono"/>
-          <w:color w:val="000000"/>
-          <w:sz w:val="16"/>
-          <w:szCs w:val="16"/>
-        </w:rPr>
-      </w:pPr>
-      <w:r>
-        <w:rPr>
-          <w:rFonts w:ascii="Cascadia Mono" w:hAnsi="Cascadia Mono" w:cs="Cascadia Mono"/>
-          <w:color w:val="000000"/>
-          <w:sz w:val="16"/>
-          <w:szCs w:val="16"/>
-        </w:rPr>
-        <w:t xml:space="preserve">    {</w:t>
-      </w:r>
-    </w:p>
-    <w:p>
-      <w:pPr>
-        <w:autoSpaceDE w:val="0"/>
-        <w:autoSpaceDN w:val="0"/>
-        <w:adjustRightInd w:val="0"/>
-        <w:spacing w:after="0" w:line="240" w:lineRule="auto"/>
-        <w:ind w:left="426"/>
-        <w:rPr>
-          <w:rFonts w:ascii="Cascadia Mono" w:hAnsi="Cascadia Mono" w:cs="Cascadia Mono"/>
-          <w:color w:val="000000"/>
-          <w:sz w:val="16"/>
-          <w:szCs w:val="16"/>
-        </w:rPr>
-      </w:pPr>
-      <w:r>
-        <w:rPr>
-          <w:rFonts w:ascii="Cascadia Mono" w:hAnsi="Cascadia Mono" w:cs="Cascadia Mono"/>
-          <w:color w:val="000000"/>
-          <w:sz w:val="16"/>
-          <w:szCs w:val="16"/>
-        </w:rPr>
-        <w:t xml:space="preserve">        </w:t>
-      </w:r>
-      <w:r>
-        <w:rPr>
-          <w:rFonts w:ascii="Cascadia Mono" w:hAnsi="Cascadia Mono" w:cs="Cascadia Mono"/>
-          <w:color w:val="0000FF"/>
-          <w:sz w:val="16"/>
-          <w:szCs w:val="16"/>
-        </w:rPr>
-        <w:t>int</w:t>
-      </w:r>
-      <w:r>
-        <w:rPr>
-          <w:rFonts w:ascii="Cascadia Mono" w:hAnsi="Cascadia Mono" w:cs="Cascadia Mono"/>
-          <w:color w:val="000000"/>
-          <w:sz w:val="16"/>
-          <w:szCs w:val="16"/>
-        </w:rPr>
-        <w:t xml:space="preserve"> x = x0 + (i * diffX + mulX * diff / 2) / diff;</w:t>
-      </w:r>
-    </w:p>
-    <w:p>
-      <w:pPr>
-        <w:autoSpaceDE w:val="0"/>
-        <w:autoSpaceDN w:val="0"/>
-        <w:adjustRightInd w:val="0"/>
-        <w:spacing w:after="0" w:line="240" w:lineRule="auto"/>
-        <w:ind w:left="426"/>
-        <w:rPr>
-          <w:rFonts w:ascii="Cascadia Mono" w:hAnsi="Cascadia Mono" w:cs="Cascadia Mono"/>
-          <w:color w:val="000000"/>
-          <w:sz w:val="16"/>
-          <w:szCs w:val="16"/>
-        </w:rPr>
-      </w:pPr>
-      <w:r>
-        <w:rPr>
-          <w:rFonts w:ascii="Cascadia Mono" w:hAnsi="Cascadia Mono" w:cs="Cascadia Mono"/>
-          <w:color w:val="000000"/>
-          <w:sz w:val="16"/>
-          <w:szCs w:val="16"/>
-        </w:rPr>
-        <w:t xml:space="preserve">        </w:t>
-      </w:r>
-      <w:r>
-        <w:rPr>
-          <w:rFonts w:ascii="Cascadia Mono" w:hAnsi="Cascadia Mono" w:cs="Cascadia Mono"/>
-          <w:color w:val="0000FF"/>
-          <w:sz w:val="16"/>
-          <w:szCs w:val="16"/>
-        </w:rPr>
-        <w:t>int</w:t>
-      </w:r>
-      <w:r>
-        <w:rPr>
-          <w:rFonts w:ascii="Cascadia Mono" w:hAnsi="Cascadia Mono" w:cs="Cascadia Mono"/>
-          <w:color w:val="000000"/>
-          <w:sz w:val="16"/>
-          <w:szCs w:val="16"/>
-        </w:rPr>
-        <w:t xml:space="preserve"> y = y0 + (i * diffY + mulY * diff / 2) / diff;</w:t>
-      </w:r>
-    </w:p>
-    <w:p>
-      <w:pPr>
-        <w:autoSpaceDE w:val="0"/>
-        <w:autoSpaceDN w:val="0"/>
-        <w:adjustRightInd w:val="0"/>
-        <w:spacing w:after="0" w:line="240" w:lineRule="auto"/>
-        <w:ind w:left="426"/>
-        <w:rPr>
-          <w:rFonts w:ascii="Cascadia Mono" w:hAnsi="Cascadia Mono" w:cs="Cascadia Mono"/>
-          <w:color w:val="000000"/>
-          <w:sz w:val="16"/>
-          <w:szCs w:val="16"/>
-        </w:rPr>
-      </w:pPr>
-      <w:r>
-        <w:rPr>
-          <w:rFonts w:ascii="Cascadia Mono" w:hAnsi="Cascadia Mono" w:cs="Cascadia Mono"/>
-          <w:color w:val="000000"/>
-          <w:sz w:val="16"/>
-          <w:szCs w:val="16"/>
-        </w:rPr>
-        <w:t xml:space="preserve">        DrawDot(x, y, color);</w:t>
-      </w:r>
-    </w:p>
-    <w:p>
-      <w:pPr>
-        <w:autoSpaceDE w:val="0"/>
-        <w:autoSpaceDN w:val="0"/>
-        <w:adjustRightInd w:val="0"/>
-        <w:spacing w:after="0" w:line="240" w:lineRule="auto"/>
-        <w:ind w:left="426"/>
-        <w:rPr>
-          <w:rFonts w:ascii="Cascadia Mono" w:hAnsi="Cascadia Mono" w:cs="Cascadia Mono"/>
-          <w:color w:val="000000"/>
-          <w:sz w:val="16"/>
-          <w:szCs w:val="16"/>
-        </w:rPr>
-      </w:pPr>
-      <w:r>
-        <w:rPr>
-          <w:rFonts w:ascii="Cascadia Mono" w:hAnsi="Cascadia Mono" w:cs="Cascadia Mono"/>
-          <w:color w:val="000000"/>
-          <w:sz w:val="16"/>
-          <w:szCs w:val="16"/>
-        </w:rPr>
-        <w:t xml:space="preserve">    }</w:t>
-      </w:r>
-      <w:r>
-        <w:rPr>
-          <w:rFonts w:ascii="Cascadia Mono" w:hAnsi="Cascadia Mono" w:cs="Cascadia Mono"/>
-          <w:color w:val="000000"/>
-          <w:sz w:val="16"/>
-          <w:szCs w:val="16"/>
-        </w:rPr>
-        <w:br/>
-      </w:r>
     </w:p>
     <w:p>
       <w:pPr>
@@ -828,6 +1551,7 @@
         </w:numPr>
         <w:ind w:left="426"/>
       </w:pPr>
+      <w:proofErr w:type="spellStart"/>
       <w:r>
         <w:rPr>
           <w:rFonts w:ascii="Cascadia Mono" w:hAnsi="Cascadia Mono" w:cs="Cascadia Mono"/>
@@ -846,6 +1570,7 @@
         </w:rPr>
         <w:t>Box</w:t>
       </w:r>
+      <w:proofErr w:type="spellEnd"/>
       <w:r>
         <w:rPr>
           <w:rFonts w:ascii="Cascadia Mono" w:hAnsi="Cascadia Mono" w:cs="Cascadia Mono"/>
@@ -855,8 +1580,13 @@
         </w:rPr>
         <w:br/>
       </w:r>
-      <w:r>
-        <w:t xml:space="preserve">Zeichnet den Umriss eines </w:t>
+      <w:proofErr w:type="gramStart"/>
+      <w:r>
+        <w:t>Zeichnet</w:t>
+      </w:r>
+      <w:proofErr w:type="gramEnd"/>
+      <w:r>
+        <w:t xml:space="preserve"> den Umriss eines </w:t>
       </w:r>
       <w:r>
         <w:t>Rechtecks</w:t>
@@ -865,8 +1595,13 @@
         <w:t xml:space="preserve"> mit der angegebenen Farbe</w:t>
       </w:r>
       <w:r>
-        <w:t xml:space="preserve"> - verwende dazu DrawLine</w:t>
-      </w:r>
+        <w:t xml:space="preserve"> - verwende dazu </w:t>
+      </w:r>
+      <w:proofErr w:type="spellStart"/>
+      <w:r>
+        <w:t>DrawLine</w:t>
+      </w:r>
+      <w:proofErr w:type="spellEnd"/>
       <w:r>
         <w:t xml:space="preserve">. </w:t>
       </w:r>
@@ -878,7 +1613,15 @@
         <w:t>Rechteck</w:t>
       </w:r>
       <w:r>
-        <w:t xml:space="preserve"> wird durch zwei Punkte (x0:y0 und x1:y1) angegeben.</w:t>
+        <w:t xml:space="preserve"> wird durch zwei Punkte (x</w:t>
+      </w:r>
+      <w:proofErr w:type="gramStart"/>
+      <w:r>
+        <w:t>0:y</w:t>
+      </w:r>
+      <w:proofErr w:type="gramEnd"/>
+      <w:r>
+        <w:t>0 und x1:y1) angegeben.</w:t>
       </w:r>
       <w:r>
         <w:br/>
@@ -893,6 +1636,7 @@
         </w:numPr>
         <w:ind w:left="426"/>
       </w:pPr>
+      <w:proofErr w:type="spellStart"/>
       <w:r>
         <w:rPr>
           <w:rFonts w:ascii="Cascadia Mono" w:hAnsi="Cascadia Mono" w:cs="Cascadia Mono"/>
@@ -902,23 +1646,45 @@
         </w:rPr>
         <w:t>FillBox</w:t>
       </w:r>
+      <w:proofErr w:type="spellEnd"/>
       <w:r>
         <w:br/>
       </w:r>
-      <w:r>
-        <w:t xml:space="preserve">Zeichnet ein </w:t>
+      <w:proofErr w:type="gramStart"/>
+      <w:r>
+        <w:t>Zeichnet</w:t>
+      </w:r>
+      <w:proofErr w:type="gramEnd"/>
+      <w:r>
+        <w:t xml:space="preserve"> ein </w:t>
       </w:r>
       <w:r>
         <w:t>Rechteck</w:t>
       </w:r>
       <w:r>
-        <w:t>. Im Gegensatz zu DrawBox wird die gesamte Fläche gezeichnet</w:t>
+        <w:t xml:space="preserve">. Im Gegensatz zu </w:t>
+      </w:r>
+      <w:proofErr w:type="spellStart"/>
+      <w:r>
+        <w:t>DrawBox</w:t>
+      </w:r>
+      <w:proofErr w:type="spellEnd"/>
+      <w:r>
+        <w:t xml:space="preserve"> wird die gesamte Fläche gezeichnet</w:t>
       </w:r>
       <w:r>
         <w:t>/ausgefüllt</w:t>
       </w:r>
       <w:r>
-        <w:t xml:space="preserve"> (DrawDot)</w:t>
+        <w:t xml:space="preserve"> (</w:t>
+      </w:r>
+      <w:proofErr w:type="spellStart"/>
+      <w:r>
+        <w:t>DrawDot</w:t>
+      </w:r>
+      <w:proofErr w:type="spellEnd"/>
+      <w:r>
+        <w:t>)</w:t>
       </w:r>
     </w:p>
     <w:p/>
@@ -988,7 +1754,15 @@
         <w:br/>
       </w:r>
       <w:r>
-        <w:t>Verwende die oben angeführten Methoden um ein Haus zu zeichnen</w:t>
+        <w:t xml:space="preserve">Verwende die oben angeführten </w:t>
+      </w:r>
+      <w:proofErr w:type="gramStart"/>
+      <w:r>
+        <w:t>Methoden</w:t>
+      </w:r>
+      <w:proofErr w:type="gramEnd"/>
+      <w:r>
+        <w:t xml:space="preserve"> um ein Haus zu zeichnen</w:t>
       </w:r>
       <w:r>
         <w:t>.</w:t>
@@ -1002,14 +1776,36 @@
         <w:t>Rechteck</w:t>
       </w:r>
       <w:r>
-        <w:t xml:space="preserve"> (DrawBox</w:t>
-      </w:r>
-      <w:r>
-        <w:t>, grau</w:t>
-      </w:r>
-      <w:r>
-        <w:t>) mit der Abmessung 17x11. Es enthält eine Tür (FillBox</w:t>
-      </w:r>
+        <w:t xml:space="preserve"> (</w:t>
+      </w:r>
+      <w:proofErr w:type="spellStart"/>
+      <w:r>
+        <w:t>DrawBox</w:t>
+      </w:r>
+      <w:proofErr w:type="spellEnd"/>
+      <w:r>
+        <w:t xml:space="preserve">, </w:t>
+      </w:r>
+      <w:r>
+        <w:t xml:space="preserve">0:0-17:10, </w:t>
+      </w:r>
+      <w:r>
+        <w:t>Farbe je nach Haus</w:t>
+      </w:r>
+      <w:r>
+        <w:t xml:space="preserve">). </w:t>
+      </w:r>
+      <w:r>
+        <w:br/>
+      </w:r>
+      <w:r>
+        <w:t>Es enthält eine Tür (</w:t>
+      </w:r>
+      <w:proofErr w:type="spellStart"/>
+      <w:r>
+        <w:t>FillBox</w:t>
+      </w:r>
+      <w:proofErr w:type="spellEnd"/>
       <w:r>
         <w:t>, dunkelrot</w:t>
       </w:r>
@@ -1020,10 +1816,21 @@
         <w:t xml:space="preserve"> </w:t>
       </w:r>
       <w:r>
-        <w:t>(FillBox</w:t>
-      </w:r>
-      <w:r>
-        <w:t>, weiß</w:t>
+        <w:t>(</w:t>
+      </w:r>
+      <w:proofErr w:type="spellStart"/>
+      <w:r>
+        <w:t>FillBox</w:t>
+      </w:r>
+      <w:proofErr w:type="spellEnd"/>
+      <w:r>
+        <w:t xml:space="preserve">, </w:t>
+      </w:r>
+      <w:r>
+        <w:t xml:space="preserve">10:2, 3:6 und 10:6, </w:t>
+      </w:r>
+      <w:r>
+        <w:t>weiß</w:t>
       </w:r>
       <w:r>
         <w:t>).</w:t>
@@ -1033,7 +1840,27 @@
         <w:t xml:space="preserve">Der Giebel </w:t>
       </w:r>
       <w:r>
-        <w:t>sind zwei schräge Linien (DrawLine, grau).</w:t>
+        <w:t>sind zwei schräge Linien (</w:t>
+      </w:r>
+      <w:proofErr w:type="spellStart"/>
+      <w:r>
+        <w:t>DrawLine</w:t>
+      </w:r>
+      <w:proofErr w:type="spellEnd"/>
+      <w:r>
+        <w:t xml:space="preserve">, </w:t>
+      </w:r>
+      <w:r>
+        <w:t>-1:9-</w:t>
+      </w:r>
+      <w:r>
+        <w:t xml:space="preserve">8:18 und 9:18-18:9, </w:t>
+      </w:r>
+      <w:r>
+        <w:t>Farbe je nach Haus</w:t>
+      </w:r>
+      <w:r>
+        <w:t>).</w:t>
       </w:r>
     </w:p>
     <w:p/>
@@ -1072,7 +1899,14 @@
       </w:r>
       <w:r>
         <w:br/>
-        <w:t>Entscheidet sich der Programmierer die Fenster anders zu zeichnen, so ist diese Änderung im Programm nur einmal vorzunehmen.</w:t>
+      </w:r>
+      <w:proofErr w:type="gramStart"/>
+      <w:r>
+        <w:t>Entscheidet</w:t>
+      </w:r>
+      <w:proofErr w:type="gramEnd"/>
+      <w:r>
+        <w:t xml:space="preserve"> sich der Programmierer die Fenster anders zu zeichnen, so ist diese Änderung im Programm nur einmal vorzunehmen.</w:t>
       </w:r>
     </w:p>
     <w:p>
@@ -1109,37 +1943,367 @@
       <w:r>
         <w:t>Gib dem Programmierer die Möglichkeit, eine Siedlung zu zeichnen.</w:t>
       </w:r>
-      <w:r>
-        <w:br/>
-      </w:r>
-      <w:r>
-        <w:t xml:space="preserve"> </w:t>
-      </w:r>
     </w:p>
     <w:p>
       <w:pPr>
-        <w:spacing w:after="0" w:line="240" w:lineRule="auto"/>
-        <w:rPr>
-          <w:rFonts w:ascii="Courier New" w:hAnsi="Courier New" w:cs="Courier New"/>
-        </w:rPr>
-      </w:pPr>
+        <w:pStyle w:val="berschrift2"/>
+      </w:pPr>
+      <w:r>
+        <w:t>Beispiel</w:t>
+      </w:r>
     </w:p>
     <w:p>
-      <w:r>
-        <w:br/>
+      <w:pPr>
+        <w:autoSpaceDE w:val="0"/>
+        <w:autoSpaceDN w:val="0"/>
+        <w:adjustRightInd w:val="0"/>
+        <w:spacing w:after="0" w:line="240" w:lineRule="auto"/>
+        <w:rPr>
+          <w:rFonts w:ascii="Cascadia Mono" w:hAnsi="Cascadia Mono" w:cs="Cascadia Mono"/>
+          <w:color w:val="000000"/>
+          <w:sz w:val="19"/>
+          <w:szCs w:val="19"/>
+        </w:rPr>
+      </w:pPr>
+      <w:r>
+        <w:rPr>
+          <w:rFonts w:ascii="Courier New" w:hAnsi="Courier New" w:cs="Courier New"/>
+        </w:rPr>
+        <w:drawing>
+          <wp:inline distT="0" distB="0" distL="0" distR="0" wp14:anchorId="7526216E" wp14:editId="7CABFC9D">
+            <wp:extent cx="3676650" cy="2317169"/>
+            <wp:effectExtent l="0" t="0" r="0" b="6985"/>
+            <wp:docPr id="3" name="Grafik 3" descr="Ein Bild, das Text, Licht enthält.&#10;&#10;Automatisch generierte Beschreibung"/>
+            <wp:cNvGraphicFramePr>
+              <a:graphicFrameLocks xmlns:a="http://schemas.openxmlformats.org/drawingml/2006/main" noChangeAspect="1"/>
+            </wp:cNvGraphicFramePr>
+            <a:graphic xmlns:a="http://schemas.openxmlformats.org/drawingml/2006/main">
+              <a:graphicData uri="http://schemas.openxmlformats.org/drawingml/2006/picture">
+                <pic:pic xmlns:pic="http://schemas.openxmlformats.org/drawingml/2006/picture">
+                  <pic:nvPicPr>
+                    <pic:cNvPr id="3" name="Grafik 3" descr="Ein Bild, das Text, Licht enthält.&#10;&#10;Automatisch generierte Beschreibung"/>
+                    <pic:cNvPicPr/>
+                  </pic:nvPicPr>
+                  <pic:blipFill>
+                    <a:blip r:embed="rId8"/>
+                    <a:stretch>
+                      <a:fillRect/>
+                    </a:stretch>
+                  </pic:blipFill>
+                  <pic:spPr>
+                    <a:xfrm>
+                      <a:off x="0" y="0"/>
+                      <a:ext cx="3701089" cy="2332571"/>
+                    </a:xfrm>
+                    <a:prstGeom prst="rect">
+                      <a:avLst/>
+                    </a:prstGeom>
+                  </pic:spPr>
+                </pic:pic>
+              </a:graphicData>
+            </a:graphic>
+          </wp:inline>
+        </w:drawing>
       </w:r>
     </w:p>
     <w:p>
       <w:pPr>
+        <w:autoSpaceDE w:val="0"/>
+        <w:autoSpaceDN w:val="0"/>
+        <w:adjustRightInd w:val="0"/>
         <w:spacing w:after="0" w:line="240" w:lineRule="auto"/>
         <w:rPr>
-          <w:rFonts w:ascii="Courier New" w:hAnsi="Courier New" w:cs="Courier New"/>
-        </w:rPr>
-      </w:pPr>
+          <w:rFonts w:ascii="Cascadia Mono" w:hAnsi="Cascadia Mono" w:cs="Cascadia Mono"/>
+          <w:color w:val="000000"/>
+          <w:sz w:val="19"/>
+          <w:szCs w:val="19"/>
+        </w:rPr>
+      </w:pPr>
+    </w:p>
+    <w:p>
+      <w:pPr>
+        <w:autoSpaceDE w:val="0"/>
+        <w:autoSpaceDN w:val="0"/>
+        <w:adjustRightInd w:val="0"/>
+        <w:spacing w:after="0" w:line="240" w:lineRule="auto"/>
+        <w:rPr>
+          <w:rFonts w:ascii="Cascadia Mono" w:hAnsi="Cascadia Mono" w:cs="Cascadia Mono"/>
+          <w:color w:val="000000"/>
+          <w:sz w:val="19"/>
+          <w:szCs w:val="19"/>
+        </w:rPr>
+      </w:pPr>
+      <w:proofErr w:type="spellStart"/>
+      <w:proofErr w:type="gramStart"/>
+      <w:r>
+        <w:rPr>
+          <w:rFonts w:ascii="Cascadia Mono" w:hAnsi="Cascadia Mono" w:cs="Cascadia Mono"/>
+          <w:color w:val="000000"/>
+          <w:sz w:val="19"/>
+          <w:szCs w:val="19"/>
+        </w:rPr>
+        <w:t>DrawLine</w:t>
+      </w:r>
+      <w:proofErr w:type="spellEnd"/>
+      <w:r>
+        <w:rPr>
+          <w:rFonts w:ascii="Cascadia Mono" w:hAnsi="Cascadia Mono" w:cs="Cascadia Mono"/>
+          <w:color w:val="000000"/>
+          <w:sz w:val="19"/>
+          <w:szCs w:val="19"/>
+        </w:rPr>
+        <w:t>(</w:t>
+      </w:r>
+      <w:proofErr w:type="gramEnd"/>
+      <w:r>
+        <w:rPr>
+          <w:rFonts w:ascii="Cascadia Mono" w:hAnsi="Cascadia Mono" w:cs="Cascadia Mono"/>
+          <w:color w:val="000000"/>
+          <w:sz w:val="19"/>
+          <w:szCs w:val="19"/>
+        </w:rPr>
+        <w:t xml:space="preserve">0, 0, COLS - 1, 0, </w:t>
+      </w:r>
+      <w:proofErr w:type="spellStart"/>
+      <w:r>
+        <w:rPr>
+          <w:rFonts w:ascii="Cascadia Mono" w:hAnsi="Cascadia Mono" w:cs="Cascadia Mono"/>
+          <w:color w:val="000000"/>
+          <w:sz w:val="19"/>
+          <w:szCs w:val="19"/>
+        </w:rPr>
+        <w:t>ConsoleColor.Green</w:t>
+      </w:r>
+      <w:proofErr w:type="spellEnd"/>
+      <w:r>
+        <w:rPr>
+          <w:rFonts w:ascii="Cascadia Mono" w:hAnsi="Cascadia Mono" w:cs="Cascadia Mono"/>
+          <w:color w:val="000000"/>
+          <w:sz w:val="19"/>
+          <w:szCs w:val="19"/>
+        </w:rPr>
+        <w:t>);</w:t>
+      </w:r>
+    </w:p>
+    <w:p>
+      <w:pPr>
+        <w:autoSpaceDE w:val="0"/>
+        <w:autoSpaceDN w:val="0"/>
+        <w:adjustRightInd w:val="0"/>
+        <w:spacing w:after="0" w:line="240" w:lineRule="auto"/>
+        <w:rPr>
+          <w:rFonts w:ascii="Cascadia Mono" w:hAnsi="Cascadia Mono" w:cs="Cascadia Mono"/>
+          <w:color w:val="000000"/>
+          <w:sz w:val="19"/>
+          <w:szCs w:val="19"/>
+        </w:rPr>
+      </w:pPr>
+      <w:proofErr w:type="spellStart"/>
+      <w:proofErr w:type="gramStart"/>
+      <w:r>
+        <w:rPr>
+          <w:rFonts w:ascii="Cascadia Mono" w:hAnsi="Cascadia Mono" w:cs="Cascadia Mono"/>
+          <w:color w:val="000000"/>
+          <w:sz w:val="19"/>
+          <w:szCs w:val="19"/>
+        </w:rPr>
+        <w:t>DrawAHouse</w:t>
+      </w:r>
+      <w:proofErr w:type="spellEnd"/>
+      <w:r>
+        <w:rPr>
+          <w:rFonts w:ascii="Cascadia Mono" w:hAnsi="Cascadia Mono" w:cs="Cascadia Mono"/>
+          <w:color w:val="000000"/>
+          <w:sz w:val="19"/>
+          <w:szCs w:val="19"/>
+        </w:rPr>
+        <w:t>(</w:t>
+      </w:r>
+      <w:proofErr w:type="gramEnd"/>
+      <w:r>
+        <w:rPr>
+          <w:rFonts w:ascii="Cascadia Mono" w:hAnsi="Cascadia Mono" w:cs="Cascadia Mono"/>
+          <w:color w:val="000000"/>
+          <w:sz w:val="19"/>
+          <w:szCs w:val="19"/>
+        </w:rPr>
+        <w:t xml:space="preserve">5, 1, </w:t>
+      </w:r>
+      <w:proofErr w:type="spellStart"/>
+      <w:r>
+        <w:rPr>
+          <w:rFonts w:ascii="Cascadia Mono" w:hAnsi="Cascadia Mono" w:cs="Cascadia Mono"/>
+          <w:color w:val="000000"/>
+          <w:sz w:val="19"/>
+          <w:szCs w:val="19"/>
+        </w:rPr>
+        <w:t>ConsoleColor.White</w:t>
+      </w:r>
+      <w:proofErr w:type="spellEnd"/>
+      <w:r>
+        <w:rPr>
+          <w:rFonts w:ascii="Cascadia Mono" w:hAnsi="Cascadia Mono" w:cs="Cascadia Mono"/>
+          <w:color w:val="000000"/>
+          <w:sz w:val="19"/>
+          <w:szCs w:val="19"/>
+        </w:rPr>
+        <w:t>);</w:t>
+      </w:r>
+    </w:p>
+    <w:p>
+      <w:pPr>
+        <w:autoSpaceDE w:val="0"/>
+        <w:autoSpaceDN w:val="0"/>
+        <w:adjustRightInd w:val="0"/>
+        <w:spacing w:after="0" w:line="240" w:lineRule="auto"/>
+        <w:rPr>
+          <w:rFonts w:ascii="Cascadia Mono" w:hAnsi="Cascadia Mono" w:cs="Cascadia Mono"/>
+          <w:color w:val="000000"/>
+          <w:sz w:val="19"/>
+          <w:szCs w:val="19"/>
+        </w:rPr>
+      </w:pPr>
+      <w:proofErr w:type="spellStart"/>
+      <w:proofErr w:type="gramStart"/>
+      <w:r>
+        <w:rPr>
+          <w:rFonts w:ascii="Cascadia Mono" w:hAnsi="Cascadia Mono" w:cs="Cascadia Mono"/>
+          <w:color w:val="000000"/>
+          <w:sz w:val="19"/>
+          <w:szCs w:val="19"/>
+        </w:rPr>
+        <w:t>DrawAHouse</w:t>
+      </w:r>
+      <w:proofErr w:type="spellEnd"/>
+      <w:r>
+        <w:rPr>
+          <w:rFonts w:ascii="Cascadia Mono" w:hAnsi="Cascadia Mono" w:cs="Cascadia Mono"/>
+          <w:color w:val="000000"/>
+          <w:sz w:val="19"/>
+          <w:szCs w:val="19"/>
+        </w:rPr>
+        <w:t>(</w:t>
+      </w:r>
+      <w:proofErr w:type="gramEnd"/>
+      <w:r>
+        <w:rPr>
+          <w:rFonts w:ascii="Cascadia Mono" w:hAnsi="Cascadia Mono" w:cs="Cascadia Mono"/>
+          <w:color w:val="000000"/>
+          <w:sz w:val="19"/>
+          <w:szCs w:val="19"/>
+        </w:rPr>
+        <w:t xml:space="preserve">30, 2, </w:t>
+      </w:r>
+      <w:proofErr w:type="spellStart"/>
+      <w:r>
+        <w:rPr>
+          <w:rFonts w:ascii="Cascadia Mono" w:hAnsi="Cascadia Mono" w:cs="Cascadia Mono"/>
+          <w:color w:val="000000"/>
+          <w:sz w:val="19"/>
+          <w:szCs w:val="19"/>
+        </w:rPr>
+        <w:t>ConsoleColor.</w:t>
+      </w:r>
+      <w:r>
+        <w:rPr>
+          <w:rFonts w:ascii="Cascadia Mono" w:hAnsi="Cascadia Mono" w:cs="Cascadia Mono"/>
+          <w:color w:val="000000"/>
+          <w:sz w:val="19"/>
+          <w:szCs w:val="19"/>
+        </w:rPr>
+        <w:t>Magenta</w:t>
+      </w:r>
+      <w:proofErr w:type="spellEnd"/>
+      <w:r>
+        <w:rPr>
+          <w:rFonts w:ascii="Cascadia Mono" w:hAnsi="Cascadia Mono" w:cs="Cascadia Mono"/>
+          <w:color w:val="000000"/>
+          <w:sz w:val="19"/>
+          <w:szCs w:val="19"/>
+        </w:rPr>
+        <w:t>);</w:t>
+      </w:r>
+    </w:p>
+    <w:p>
+      <w:pPr>
+        <w:autoSpaceDE w:val="0"/>
+        <w:autoSpaceDN w:val="0"/>
+        <w:adjustRightInd w:val="0"/>
+        <w:spacing w:after="0" w:line="240" w:lineRule="auto"/>
+        <w:rPr>
+          <w:rFonts w:ascii="Cascadia Mono" w:hAnsi="Cascadia Mono" w:cs="Cascadia Mono"/>
+          <w:color w:val="000000"/>
+          <w:sz w:val="19"/>
+          <w:szCs w:val="19"/>
+        </w:rPr>
+      </w:pPr>
+      <w:proofErr w:type="spellStart"/>
+      <w:proofErr w:type="gramStart"/>
+      <w:r>
+        <w:rPr>
+          <w:rFonts w:ascii="Cascadia Mono" w:hAnsi="Cascadia Mono" w:cs="Cascadia Mono"/>
+          <w:color w:val="000000"/>
+          <w:sz w:val="19"/>
+          <w:szCs w:val="19"/>
+        </w:rPr>
+        <w:t>DrawAHouse</w:t>
+      </w:r>
+      <w:proofErr w:type="spellEnd"/>
+      <w:r>
+        <w:rPr>
+          <w:rFonts w:ascii="Cascadia Mono" w:hAnsi="Cascadia Mono" w:cs="Cascadia Mono"/>
+          <w:color w:val="000000"/>
+          <w:sz w:val="19"/>
+          <w:szCs w:val="19"/>
+        </w:rPr>
+        <w:t>(</w:t>
+      </w:r>
+      <w:proofErr w:type="gramEnd"/>
+      <w:r>
+        <w:rPr>
+          <w:rFonts w:ascii="Cascadia Mono" w:hAnsi="Cascadia Mono" w:cs="Cascadia Mono"/>
+          <w:color w:val="000000"/>
+          <w:sz w:val="19"/>
+          <w:szCs w:val="19"/>
+        </w:rPr>
+        <w:t xml:space="preserve">55, 3, </w:t>
+      </w:r>
+      <w:proofErr w:type="spellStart"/>
+      <w:r>
+        <w:rPr>
+          <w:rFonts w:ascii="Cascadia Mono" w:hAnsi="Cascadia Mono" w:cs="Cascadia Mono"/>
+          <w:color w:val="000000"/>
+          <w:sz w:val="19"/>
+          <w:szCs w:val="19"/>
+        </w:rPr>
+        <w:t>ConsoleColor.</w:t>
+      </w:r>
+      <w:r>
+        <w:rPr>
+          <w:rFonts w:ascii="Cascadia Mono" w:hAnsi="Cascadia Mono" w:cs="Cascadia Mono"/>
+          <w:color w:val="000000"/>
+          <w:sz w:val="19"/>
+          <w:szCs w:val="19"/>
+        </w:rPr>
+        <w:t>Yellow</w:t>
+      </w:r>
+      <w:proofErr w:type="spellEnd"/>
+      <w:r>
+        <w:rPr>
+          <w:rFonts w:ascii="Cascadia Mono" w:hAnsi="Cascadia Mono" w:cs="Cascadia Mono"/>
+          <w:color w:val="000000"/>
+          <w:sz w:val="19"/>
+          <w:szCs w:val="19"/>
+        </w:rPr>
+        <w:t>);</w:t>
+      </w:r>
+      <w:r>
+        <w:br/>
+      </w:r>
     </w:p>
     <w:sectPr>
-      <w:headerReference w:type="default" r:id="rId8"/>
-      <w:footerReference w:type="default" r:id="rId9"/>
+      <w:headerReference w:type="default" r:id="rId9"/>
+      <w:footerReference w:type="default" r:id="rId10"/>
       <w:pgSz w:w="11906" w:h="16838"/>
       <w:pgMar w:top="1417" w:right="707" w:bottom="1134" w:left="1417" w:header="708" w:footer="708" w:gutter="0"/>
       <w:cols w:space="708"/>
@@ -1319,8 +2483,18 @@
               <w:sz w:val="28"/>
               <w:szCs w:val="28"/>
             </w:rPr>
-            <w:t>Draw a house</w:t>
+            <w:t xml:space="preserve">Draw a </w:t>
           </w:r>
+          <w:proofErr w:type="spellStart"/>
+          <w:r>
+            <w:rPr>
+              <w:rFonts w:ascii="Times New Roman" w:hAnsi="Times New Roman" w:cs="Times New Roman"/>
+              <w:sz w:val="28"/>
+              <w:szCs w:val="28"/>
+            </w:rPr>
+            <w:t>house</w:t>
+          </w:r>
+          <w:proofErr w:type="spellEnd"/>
           <w:r>
             <w:rPr>
               <w:rFonts w:ascii="Times New Roman" w:hAnsi="Times New Roman" w:cs="Times New Roman"/>

</xml_diff>